<commit_message>
added ict 275 assessment 3
</commit_message>
<xml_diff>
--- a/ICT371 ARTIFICIAL INTELLIGENCE T126/Assigment 4/ICT371_Assessment4_8Puzzle_Report.docx
+++ b/ICT371 ARTIFICIAL INTELLIGENCE T126/Assigment 4/ICT371_Assessment4_8Puzzle_Report.docx
@@ -1,14 +1,21 @@
 
 <file path=word/document.xml><?xml version="1.0" encoding="utf-8"?>
-<w:document xmlns:wpc="http://schemas.microsoft.com/office/word/2010/wordprocessingCanvas" xmlns:cx="http://schemas.microsoft.com/office/drawing/2014/chartex" xmlns:cx1="http://schemas.microsoft.com/office/drawing/2015/9/8/chartex" xmlns:cx2="http://schemas.microsoft.com/office/drawing/2015/10/21/chartex" xmlns:cx3="http://schemas.microsoft.com/office/drawing/2016/5/9/chartex" xmlns:cx4="http://schemas.microsoft.com/office/drawing/2016/5/10/chartex" xmlns:cx5="http://schemas.microsoft.com/office/drawing/2016/5/11/chartex" xmlns:cx6="http://schemas.microsoft.com/office/drawing/2016/5/12/chartex" xmlns:cx7="http://schemas.microsoft.com/office/drawing/2016/5/13/chartex" xmlns:cx8="http://schemas.microsoft.com/office/drawing/2016/5/14/chartex" xmlns:mc="http://schemas.openxmlformats.org/markup-compatibility/2006" xmlns:aink="http://schemas.microsoft.com/office/drawing/2016/ink" xmlns:am3d="http://schemas.microsoft.com/office/drawing/2017/model3d" xmlns:o="urn:schemas-microsoft-com:office:office" xmlns:r="http://schemas.openxmlformats.org/officeDocument/2006/relationships" xmlns:m="http://schemas.openxmlformats.org/officeDocument/2006/math" xmlns:v="urn:schemas-microsoft-com:vml" xmlns:wp14="http://schemas.microsoft.com/office/word/2010/wordprocessingDrawing" xmlns:wp="http://schemas.openxmlformats.org/drawingml/2006/wordprocessingDrawing" xmlns:w10="urn:schemas-microsoft-com:office:word" xmlns:w="http://schemas.openxmlformats.org/wordprocessingml/2006/main" xmlns:w14="http://schemas.microsoft.com/office/word/2010/wordml" xmlns:w15="http://schemas.microsoft.com/office/word/2012/wordml" xmlns:w16cex="http://schemas.microsoft.com/office/word/2018/wordml/cex" xmlns:w16cid="http://schemas.microsoft.com/office/word/2016/wordml/cid" xmlns:w16="http://schemas.microsoft.com/office/word/2018/wordml" xmlns:w16se="http://schemas.microsoft.com/office/word/2015/wordml/symex" xmlns:wpg="http://schemas.microsoft.com/office/word/2010/wordprocessingGroup" xmlns:wpi="http://schemas.microsoft.com/office/word/2010/wordprocessingInk" xmlns:wne="http://schemas.microsoft.com/office/word/2006/wordml" xmlns:wps="http://schemas.microsoft.com/office/word/2010/wordprocessingShape" mc:Ignorable="w14 w15 w16se w16cid w16 w16cex wp14">
+<w:document xmlns:wpc="http://schemas.microsoft.com/office/word/2010/wordprocessingCanvas" xmlns:cx="http://schemas.microsoft.com/office/drawing/2014/chartex" xmlns:cx1="http://schemas.microsoft.com/office/drawing/2015/9/8/chartex" xmlns:cx2="http://schemas.microsoft.com/office/drawing/2015/10/21/chartex" xmlns:cx3="http://schemas.microsoft.com/office/drawing/2016/5/9/chartex" xmlns:cx4="http://schemas.microsoft.com/office/drawing/2016/5/10/chartex" xmlns:cx5="http://schemas.microsoft.com/office/drawing/2016/5/11/chartex" xmlns:cx6="http://schemas.microsoft.com/office/drawing/2016/5/12/chartex" xmlns:cx7="http://schemas.microsoft.com/office/drawing/2016/5/13/chartex" xmlns:cx8="http://schemas.microsoft.com/office/drawing/2016/5/14/chartex" xmlns:mc="http://schemas.openxmlformats.org/markup-compatibility/2006" xmlns:aink="http://schemas.microsoft.com/office/drawing/2016/ink" xmlns:am3d="http://schemas.microsoft.com/office/drawing/2017/model3d" xmlns:o="urn:schemas-microsoft-com:office:office" xmlns:oel="http://schemas.microsoft.com/office/2019/extlst" xmlns:r="http://schemas.openxmlformats.org/officeDocument/2006/relationships" xmlns:m="http://schemas.openxmlformats.org/officeDocument/2006/math" xmlns:v="urn:schemas-microsoft-com:vml" xmlns:wp14="http://schemas.microsoft.com/office/word/2010/wordprocessingDrawing" xmlns:wp="http://schemas.openxmlformats.org/drawingml/2006/wordprocessingDrawing" xmlns:w10="urn:schemas-microsoft-com:office:word" xmlns:w="http://schemas.openxmlformats.org/wordprocessingml/2006/main" xmlns:w14="http://schemas.microsoft.com/office/word/2010/wordml" xmlns:w15="http://schemas.microsoft.com/office/word/2012/wordml" xmlns:w16cex="http://schemas.microsoft.com/office/word/2018/wordml/cex" xmlns:w16cid="http://schemas.microsoft.com/office/word/2016/wordml/cid" xmlns:w16="http://schemas.microsoft.com/office/word/2018/wordml" xmlns:w16sdtdh="http://schemas.microsoft.com/office/word/2020/wordml/sdtdatahash" xmlns:w16se="http://schemas.microsoft.com/office/word/2015/wordml/symex" xmlns:wpg="http://schemas.microsoft.com/office/word/2010/wordprocessingGroup" xmlns:wpi="http://schemas.microsoft.com/office/word/2010/wordprocessingInk" xmlns:wne="http://schemas.microsoft.com/office/word/2006/wordml" xmlns:wps="http://schemas.microsoft.com/office/word/2010/wordprocessingShape" mc:Ignorable="w14 w15 w16se w16cid w16 w16cex w16sdtdh wp14">
   <w:body>
     <w:p>
       <w:pPr>
         <w:pStyle w:val="Title"/>
+        <w:spacing w:line="240" w:lineRule="auto"/>
+        <w:rPr>
+          <w:sz w:val="20"/>
+          <w:szCs w:val="20"/>
+        </w:rPr>
       </w:pPr>
       <w:r>
         <w:rPr>
           <w:noProof/>
+          <w:sz w:val="20"/>
+          <w:szCs w:val="20"/>
         </w:rPr>
         <w:drawing>
           <wp:anchor distT="0" distB="0" distL="0" distR="0" simplePos="0" relativeHeight="251651584" behindDoc="0" locked="0" layoutInCell="1" allowOverlap="1" wp14:anchorId="4A8164DA" wp14:editId="6106E8EB">
@@ -57,6 +64,8 @@
       <w:r>
         <w:rPr>
           <w:noProof/>
+          <w:sz w:val="20"/>
+          <w:szCs w:val="20"/>
         </w:rPr>
         <w:drawing>
           <wp:anchor distT="0" distB="0" distL="0" distR="0" simplePos="0" relativeHeight="251652608" behindDoc="0" locked="0" layoutInCell="1" allowOverlap="1" wp14:anchorId="61226486" wp14:editId="7F774AC2">
@@ -103,26 +112,40 @@
         </w:drawing>
       </w:r>
       <w:r>
+        <w:rPr>
+          <w:sz w:val="20"/>
+          <w:szCs w:val="20"/>
+        </w:rPr>
         <w:t>KING’S</w:t>
       </w:r>
       <w:r>
         <w:rPr>
           <w:spacing w:val="-6"/>
-        </w:rPr>
-        <w:t xml:space="preserve"> </w:t>
-      </w:r>
-      <w:r>
+          <w:sz w:val="20"/>
+          <w:szCs w:val="20"/>
+        </w:rPr>
+        <w:t xml:space="preserve"> </w:t>
+      </w:r>
+      <w:r>
+        <w:rPr>
+          <w:sz w:val="20"/>
+          <w:szCs w:val="20"/>
+        </w:rPr>
         <w:t>OWN</w:t>
       </w:r>
       <w:r>
         <w:rPr>
           <w:spacing w:val="-6"/>
+          <w:sz w:val="20"/>
+          <w:szCs w:val="20"/>
         </w:rPr>
         <w:t xml:space="preserve"> </w:t>
       </w:r>
       <w:r>
         <w:rPr>
           <w:spacing w:val="-2"/>
+          <w:sz w:val="20"/>
+          <w:szCs w:val="20"/>
         </w:rPr>
         <w:t>INSTITUTE*</w:t>
       </w:r>
@@ -135,14 +158,16 @@
         <w:rPr>
           <w:rFonts w:ascii="Arial"/>
           <w:b/>
-          <w:sz w:val="24"/>
+          <w:sz w:val="20"/>
+          <w:szCs w:val="20"/>
         </w:rPr>
       </w:pPr>
       <w:r>
         <w:rPr>
           <w:rFonts w:ascii="Arial"/>
           <w:b/>
-          <w:sz w:val="24"/>
+          <w:sz w:val="20"/>
+          <w:szCs w:val="20"/>
         </w:rPr>
         <w:t>Success</w:t>
       </w:r>
@@ -151,7 +176,8 @@
           <w:rFonts w:ascii="Arial"/>
           <w:b/>
           <w:spacing w:val="-2"/>
-          <w:sz w:val="24"/>
+          <w:sz w:val="20"/>
+          <w:szCs w:val="20"/>
         </w:rPr>
         <w:t xml:space="preserve"> </w:t>
       </w:r>
@@ -159,7 +185,8 @@
         <w:rPr>
           <w:rFonts w:ascii="Arial"/>
           <w:b/>
-          <w:sz w:val="24"/>
+          <w:sz w:val="20"/>
+          <w:szCs w:val="20"/>
         </w:rPr>
         <w:t>in</w:t>
       </w:r>
@@ -168,7 +195,8 @@
           <w:rFonts w:ascii="Arial"/>
           <w:b/>
           <w:spacing w:val="-2"/>
-          <w:sz w:val="24"/>
+          <w:sz w:val="20"/>
+          <w:szCs w:val="20"/>
         </w:rPr>
         <w:t xml:space="preserve"> </w:t>
       </w:r>
@@ -176,7 +204,8 @@
         <w:rPr>
           <w:rFonts w:ascii="Arial"/>
           <w:b/>
-          <w:sz w:val="24"/>
+          <w:sz w:val="20"/>
+          <w:szCs w:val="20"/>
         </w:rPr>
         <w:t>Higher</w:t>
       </w:r>
@@ -185,7 +214,8 @@
           <w:rFonts w:ascii="Arial"/>
           <w:b/>
           <w:spacing w:val="-1"/>
-          <w:sz w:val="24"/>
+          <w:sz w:val="20"/>
+          <w:szCs w:val="20"/>
         </w:rPr>
         <w:t xml:space="preserve"> </w:t>
       </w:r>
@@ -194,7 +224,8 @@
           <w:rFonts w:ascii="Arial"/>
           <w:b/>
           <w:spacing w:val="-2"/>
-          <w:sz w:val="24"/>
+          <w:sz w:val="20"/>
+          <w:szCs w:val="20"/>
         </w:rPr>
         <w:t>Education</w:t>
       </w:r>
@@ -206,53 +237,69 @@
         <w:rPr>
           <w:rFonts w:ascii="Arial"/>
           <w:b/>
-          <w:sz w:val="24"/>
         </w:rPr>
       </w:pPr>
     </w:p>
     <w:p>
       <w:pPr>
         <w:pStyle w:val="Heading1"/>
+        <w:spacing w:line="240" w:lineRule="auto"/>
         <w:ind w:right="385"/>
-      </w:pPr>
-      <w:r>
         <w:rPr>
           <w:spacing w:val="-2"/>
+          <w:sz w:val="20"/>
+          <w:szCs w:val="20"/>
+        </w:rPr>
+      </w:pPr>
+      <w:r>
+        <w:rPr>
+          <w:spacing w:val="-2"/>
+          <w:sz w:val="20"/>
+          <w:szCs w:val="20"/>
         </w:rPr>
         <w:t>INDIVIDUAL</w:t>
       </w:r>
       <w:r>
         <w:rPr>
           <w:spacing w:val="1"/>
+          <w:sz w:val="20"/>
+          <w:szCs w:val="20"/>
         </w:rPr>
         <w:t xml:space="preserve"> </w:t>
       </w:r>
       <w:r>
         <w:rPr>
           <w:spacing w:val="-2"/>
+          <w:sz w:val="20"/>
+          <w:szCs w:val="20"/>
         </w:rPr>
         <w:t>ASSIGNMENT</w:t>
       </w:r>
       <w:r>
         <w:rPr>
           <w:spacing w:val="-1"/>
+          <w:sz w:val="20"/>
+          <w:szCs w:val="20"/>
         </w:rPr>
         <w:t xml:space="preserve"> </w:t>
       </w:r>
       <w:r>
         <w:rPr>
           <w:spacing w:val="-2"/>
+          <w:sz w:val="20"/>
+          <w:szCs w:val="20"/>
         </w:rPr>
         <w:t>COVERSHEET</w:t>
       </w:r>
     </w:p>
     <w:p>
       <w:pPr>
-        <w:pStyle w:val="BodyText"/>
-        <w:spacing w:before="252"/>
-        <w:rPr>
-          <w:rFonts w:ascii="Arial"/>
-          <w:b/>
+        <w:pStyle w:val="Heading1"/>
+        <w:spacing w:line="240" w:lineRule="auto"/>
+        <w:ind w:right="385"/>
+        <w:rPr>
+          <w:sz w:val="20"/>
+          <w:szCs w:val="20"/>
         </w:rPr>
       </w:pPr>
     </w:p>
@@ -426,6 +473,8 @@
         <w:rPr>
           <w:rFonts w:ascii="Arial"/>
           <w:b/>
+          <w:sz w:val="20"/>
+          <w:szCs w:val="20"/>
         </w:rPr>
       </w:pPr>
       <w:r>
@@ -433,6 +482,8 @@
           <w:rFonts w:ascii="Arial"/>
           <w:b/>
           <w:spacing w:val="-2"/>
+          <w:sz w:val="20"/>
+          <w:szCs w:val="20"/>
         </w:rPr>
         <w:t>Declaration</w:t>
       </w:r>
@@ -627,58 +678,98 @@
         </w:tabs>
         <w:spacing w:before="73"/>
         <w:ind w:hanging="364"/>
-      </w:pPr>
-      <w:r>
+        <w:rPr>
+          <w:sz w:val="20"/>
+          <w:szCs w:val="20"/>
+        </w:rPr>
+      </w:pPr>
+      <w:r>
+        <w:rPr>
+          <w:sz w:val="20"/>
+          <w:szCs w:val="20"/>
+        </w:rPr>
         <w:t>I</w:t>
       </w:r>
       <w:r>
         <w:rPr>
           <w:spacing w:val="-18"/>
-        </w:rPr>
-        <w:t xml:space="preserve"> </w:t>
-      </w:r>
-      <w:r>
+          <w:sz w:val="20"/>
+          <w:szCs w:val="20"/>
+        </w:rPr>
+        <w:t xml:space="preserve"> </w:t>
+      </w:r>
+      <w:r>
+        <w:rPr>
+          <w:sz w:val="20"/>
+          <w:szCs w:val="20"/>
+        </w:rPr>
         <w:t>have</w:t>
       </w:r>
       <w:r>
         <w:rPr>
           <w:spacing w:val="-15"/>
-        </w:rPr>
-        <w:t xml:space="preserve"> </w:t>
-      </w:r>
-      <w:r>
+          <w:sz w:val="20"/>
+          <w:szCs w:val="20"/>
+        </w:rPr>
+        <w:t xml:space="preserve"> </w:t>
+      </w:r>
+      <w:r>
+        <w:rPr>
+          <w:sz w:val="20"/>
+          <w:szCs w:val="20"/>
+        </w:rPr>
         <w:t>read</w:t>
       </w:r>
       <w:r>
         <w:rPr>
           <w:spacing w:val="-15"/>
-        </w:rPr>
-        <w:t xml:space="preserve"> </w:t>
-      </w:r>
-      <w:r>
+          <w:sz w:val="20"/>
+          <w:szCs w:val="20"/>
+        </w:rPr>
+        <w:t xml:space="preserve"> </w:t>
+      </w:r>
+      <w:r>
+        <w:rPr>
+          <w:sz w:val="20"/>
+          <w:szCs w:val="20"/>
+        </w:rPr>
         <w:t>and</w:t>
       </w:r>
       <w:r>
         <w:rPr>
           <w:spacing w:val="-16"/>
-        </w:rPr>
-        <w:t xml:space="preserve"> </w:t>
-      </w:r>
-      <w:r>
+          <w:sz w:val="20"/>
+          <w:szCs w:val="20"/>
+        </w:rPr>
+        <w:t xml:space="preserve"> </w:t>
+      </w:r>
+      <w:r>
+        <w:rPr>
+          <w:sz w:val="20"/>
+          <w:szCs w:val="20"/>
+        </w:rPr>
         <w:t>understood</w:t>
       </w:r>
       <w:r>
         <w:rPr>
           <w:spacing w:val="-13"/>
-        </w:rPr>
-        <w:t xml:space="preserve"> </w:t>
-      </w:r>
-      <w:r>
+          <w:sz w:val="20"/>
+          <w:szCs w:val="20"/>
+        </w:rPr>
+        <w:t xml:space="preserve"> </w:t>
+      </w:r>
+      <w:r>
+        <w:rPr>
+          <w:sz w:val="20"/>
+          <w:szCs w:val="20"/>
+        </w:rPr>
         <w:t>the</w:t>
       </w:r>
       <w:r>
         <w:rPr>
           <w:spacing w:val="-13"/>
+          <w:sz w:val="20"/>
+          <w:szCs w:val="20"/>
         </w:rPr>
         <w:t xml:space="preserve"> </w:t>
       </w:r>
@@ -686,6 +777,8 @@
         <w:rPr>
           <w:rFonts w:ascii="Arial" w:hAnsi="Arial"/>
           <w:i/>
+          <w:sz w:val="20"/>
+          <w:szCs w:val="20"/>
         </w:rPr>
         <w:t>Student</w:t>
       </w:r>
@@ -694,6 +787,8 @@
           <w:rFonts w:ascii="Arial" w:hAnsi="Arial"/>
           <w:i/>
           <w:spacing w:val="-10"/>
+          <w:sz w:val="20"/>
+          <w:szCs w:val="20"/>
         </w:rPr>
         <w:t xml:space="preserve"> </w:t>
       </w:r>
@@ -701,6 +796,8 @@
         <w:rPr>
           <w:rFonts w:ascii="Arial" w:hAnsi="Arial"/>
           <w:i/>
+          <w:sz w:val="20"/>
+          <w:szCs w:val="20"/>
         </w:rPr>
         <w:t>Academic</w:t>
       </w:r>
@@ -709,6 +806,8 @@
           <w:rFonts w:ascii="Arial" w:hAnsi="Arial"/>
           <w:i/>
           <w:spacing w:val="-14"/>
+          <w:sz w:val="20"/>
+          <w:szCs w:val="20"/>
         </w:rPr>
         <w:t xml:space="preserve"> </w:t>
       </w:r>
@@ -716,6 +815,8 @@
         <w:rPr>
           <w:rFonts w:ascii="Arial" w:hAnsi="Arial"/>
           <w:i/>
+          <w:sz w:val="20"/>
+          <w:szCs w:val="20"/>
         </w:rPr>
         <w:t>Misconduct</w:t>
       </w:r>
@@ -724,6 +825,8 @@
           <w:rFonts w:ascii="Arial" w:hAnsi="Arial"/>
           <w:i/>
           <w:spacing w:val="-17"/>
+          <w:sz w:val="20"/>
+          <w:szCs w:val="20"/>
         </w:rPr>
         <w:t xml:space="preserve"> </w:t>
       </w:r>
@@ -732,12 +835,16 @@
           <w:rFonts w:ascii="Arial" w:hAnsi="Arial"/>
           <w:i/>
           <w:spacing w:val="-2"/>
+          <w:sz w:val="20"/>
+          <w:szCs w:val="20"/>
         </w:rPr>
         <w:t>Policy</w:t>
       </w:r>
       <w:r>
         <w:rPr>
           <w:spacing w:val="-2"/>
+          <w:sz w:val="20"/>
+          <w:szCs w:val="20"/>
         </w:rPr>
         <w:t>.</w:t>
       </w:r>
@@ -754,127 +861,211 @@
         </w:tabs>
         <w:spacing w:before="74"/>
         <w:ind w:hanging="364"/>
-      </w:pPr>
-      <w:r>
+        <w:rPr>
+          <w:sz w:val="20"/>
+          <w:szCs w:val="20"/>
+        </w:rPr>
+      </w:pPr>
+      <w:r>
+        <w:rPr>
+          <w:sz w:val="20"/>
+          <w:szCs w:val="20"/>
+        </w:rPr>
         <w:t>This</w:t>
       </w:r>
       <w:r>
         <w:rPr>
           <w:spacing w:val="-18"/>
-        </w:rPr>
-        <w:t xml:space="preserve"> </w:t>
-      </w:r>
-      <w:r>
+          <w:sz w:val="20"/>
+          <w:szCs w:val="20"/>
+        </w:rPr>
+        <w:t xml:space="preserve"> </w:t>
+      </w:r>
+      <w:r>
+        <w:rPr>
+          <w:sz w:val="20"/>
+          <w:szCs w:val="20"/>
+        </w:rPr>
         <w:t>assignment</w:t>
       </w:r>
       <w:r>
         <w:rPr>
           <w:spacing w:val="-10"/>
-        </w:rPr>
-        <w:t xml:space="preserve"> </w:t>
-      </w:r>
-      <w:r>
+          <w:sz w:val="20"/>
+          <w:szCs w:val="20"/>
+        </w:rPr>
+        <w:t xml:space="preserve"> </w:t>
+      </w:r>
+      <w:r>
+        <w:rPr>
+          <w:sz w:val="20"/>
+          <w:szCs w:val="20"/>
+        </w:rPr>
         <w:t>is</w:t>
       </w:r>
       <w:r>
         <w:rPr>
           <w:spacing w:val="-11"/>
-        </w:rPr>
-        <w:t xml:space="preserve"> </w:t>
-      </w:r>
-      <w:r>
+          <w:sz w:val="20"/>
+          <w:szCs w:val="20"/>
+        </w:rPr>
+        <w:t xml:space="preserve"> </w:t>
+      </w:r>
+      <w:r>
+        <w:rPr>
+          <w:sz w:val="20"/>
+          <w:szCs w:val="20"/>
+        </w:rPr>
         <w:t>my</w:t>
       </w:r>
       <w:r>
         <w:rPr>
           <w:spacing w:val="-12"/>
-        </w:rPr>
-        <w:t xml:space="preserve"> </w:t>
-      </w:r>
-      <w:r>
+          <w:sz w:val="20"/>
+          <w:szCs w:val="20"/>
+        </w:rPr>
+        <w:t xml:space="preserve"> </w:t>
+      </w:r>
+      <w:r>
+        <w:rPr>
+          <w:sz w:val="20"/>
+          <w:szCs w:val="20"/>
+        </w:rPr>
         <w:t>own</w:t>
       </w:r>
       <w:r>
         <w:rPr>
           <w:spacing w:val="-13"/>
-        </w:rPr>
-        <w:t xml:space="preserve"> </w:t>
-      </w:r>
-      <w:r>
+          <w:sz w:val="20"/>
+          <w:szCs w:val="20"/>
+        </w:rPr>
+        <w:t xml:space="preserve"> </w:t>
+      </w:r>
+      <w:r>
+        <w:rPr>
+          <w:sz w:val="20"/>
+          <w:szCs w:val="20"/>
+        </w:rPr>
         <w:t>work</w:t>
       </w:r>
       <w:r>
         <w:rPr>
           <w:spacing w:val="-12"/>
-        </w:rPr>
-        <w:t xml:space="preserve"> </w:t>
-      </w:r>
-      <w:r>
+          <w:sz w:val="20"/>
+          <w:szCs w:val="20"/>
+        </w:rPr>
+        <w:t xml:space="preserve"> </w:t>
+      </w:r>
+      <w:r>
+        <w:rPr>
+          <w:sz w:val="20"/>
+          <w:szCs w:val="20"/>
+        </w:rPr>
         <w:t>based</w:t>
       </w:r>
       <w:r>
         <w:rPr>
           <w:spacing w:val="-9"/>
-        </w:rPr>
-        <w:t xml:space="preserve"> </w:t>
-      </w:r>
-      <w:r>
+          <w:sz w:val="20"/>
+          <w:szCs w:val="20"/>
+        </w:rPr>
+        <w:t xml:space="preserve"> </w:t>
+      </w:r>
+      <w:r>
+        <w:rPr>
+          <w:sz w:val="20"/>
+          <w:szCs w:val="20"/>
+        </w:rPr>
         <w:t>on</w:t>
       </w:r>
       <w:r>
         <w:rPr>
           <w:spacing w:val="-10"/>
-        </w:rPr>
-        <w:t xml:space="preserve"> </w:t>
-      </w:r>
-      <w:r>
+          <w:sz w:val="20"/>
+          <w:szCs w:val="20"/>
+        </w:rPr>
+        <w:t xml:space="preserve"> </w:t>
+      </w:r>
+      <w:r>
+        <w:rPr>
+          <w:sz w:val="20"/>
+          <w:szCs w:val="20"/>
+        </w:rPr>
         <w:t>my</w:t>
       </w:r>
       <w:r>
         <w:rPr>
           <w:spacing w:val="-13"/>
-        </w:rPr>
-        <w:t xml:space="preserve"> </w:t>
-      </w:r>
-      <w:r>
+          <w:sz w:val="20"/>
+          <w:szCs w:val="20"/>
+        </w:rPr>
+        <w:t xml:space="preserve"> </w:t>
+      </w:r>
+      <w:r>
+        <w:rPr>
+          <w:sz w:val="20"/>
+          <w:szCs w:val="20"/>
+        </w:rPr>
         <w:t>personal</w:t>
       </w:r>
       <w:r>
         <w:rPr>
           <w:spacing w:val="-9"/>
-        </w:rPr>
-        <w:t xml:space="preserve"> </w:t>
-      </w:r>
-      <w:r>
+          <w:sz w:val="20"/>
+          <w:szCs w:val="20"/>
+        </w:rPr>
+        <w:t xml:space="preserve"> </w:t>
+      </w:r>
+      <w:r>
+        <w:rPr>
+          <w:sz w:val="20"/>
+          <w:szCs w:val="20"/>
+        </w:rPr>
         <w:t>study</w:t>
       </w:r>
       <w:r>
         <w:rPr>
           <w:spacing w:val="-13"/>
-        </w:rPr>
-        <w:t xml:space="preserve"> </w:t>
-      </w:r>
-      <w:r>
+          <w:sz w:val="20"/>
+          <w:szCs w:val="20"/>
+        </w:rPr>
+        <w:t xml:space="preserve"> </w:t>
+      </w:r>
+      <w:r>
+        <w:rPr>
+          <w:sz w:val="20"/>
+          <w:szCs w:val="20"/>
+        </w:rPr>
         <w:t>and</w:t>
       </w:r>
       <w:r>
         <w:rPr>
           <w:spacing w:val="-8"/>
-        </w:rPr>
-        <w:t xml:space="preserve"> </w:t>
-      </w:r>
-      <w:r>
+          <w:sz w:val="20"/>
+          <w:szCs w:val="20"/>
+        </w:rPr>
+        <w:t xml:space="preserve"> </w:t>
+      </w:r>
+      <w:r>
+        <w:rPr>
+          <w:sz w:val="20"/>
+          <w:szCs w:val="20"/>
+        </w:rPr>
         <w:t>or</w:t>
       </w:r>
       <w:r>
         <w:rPr>
           <w:spacing w:val="-20"/>
+          <w:sz w:val="20"/>
+          <w:szCs w:val="20"/>
         </w:rPr>
         <w:t xml:space="preserve"> </w:t>
       </w:r>
       <w:r>
         <w:rPr>
           <w:spacing w:val="-2"/>
+          <w:sz w:val="20"/>
+          <w:szCs w:val="20"/>
         </w:rPr>
         <w:t>research.</w:t>
       </w:r>
@@ -891,125 +1082,211 @@
         </w:tabs>
         <w:spacing w:before="78"/>
         <w:ind w:right="248" w:hanging="363"/>
-      </w:pPr>
-      <w:r>
+        <w:rPr>
+          <w:sz w:val="20"/>
+          <w:szCs w:val="20"/>
+        </w:rPr>
+      </w:pPr>
+      <w:r>
+        <w:rPr>
+          <w:sz w:val="20"/>
+          <w:szCs w:val="20"/>
+        </w:rPr>
         <w:t>I</w:t>
       </w:r>
       <w:r>
         <w:rPr>
           <w:spacing w:val="-8"/>
-        </w:rPr>
-        <w:t xml:space="preserve"> </w:t>
-      </w:r>
-      <w:r>
+          <w:sz w:val="20"/>
+          <w:szCs w:val="20"/>
+        </w:rPr>
+        <w:t xml:space="preserve"> </w:t>
+      </w:r>
+      <w:r>
+        <w:rPr>
+          <w:sz w:val="20"/>
+          <w:szCs w:val="20"/>
+        </w:rPr>
         <w:t>have</w:t>
       </w:r>
       <w:r>
         <w:rPr>
           <w:spacing w:val="-15"/>
-        </w:rPr>
-        <w:t xml:space="preserve"> </w:t>
-      </w:r>
-      <w:r>
+          <w:sz w:val="20"/>
+          <w:szCs w:val="20"/>
+        </w:rPr>
+        <w:t xml:space="preserve"> </w:t>
+      </w:r>
+      <w:r>
+        <w:rPr>
+          <w:sz w:val="20"/>
+          <w:szCs w:val="20"/>
+        </w:rPr>
         <w:t>acknowledged</w:t>
       </w:r>
       <w:r>
         <w:rPr>
           <w:spacing w:val="-12"/>
-        </w:rPr>
-        <w:t xml:space="preserve"> </w:t>
-      </w:r>
-      <w:r>
+          <w:sz w:val="20"/>
+          <w:szCs w:val="20"/>
+        </w:rPr>
+        <w:t xml:space="preserve"> </w:t>
+      </w:r>
+      <w:r>
+        <w:rPr>
+          <w:sz w:val="20"/>
+          <w:szCs w:val="20"/>
+        </w:rPr>
         <w:t>all</w:t>
       </w:r>
       <w:r>
         <w:rPr>
           <w:spacing w:val="-15"/>
-        </w:rPr>
-        <w:t xml:space="preserve"> </w:t>
-      </w:r>
-      <w:r>
+          <w:sz w:val="20"/>
+          <w:szCs w:val="20"/>
+        </w:rPr>
+        <w:t xml:space="preserve"> </w:t>
+      </w:r>
+      <w:r>
+        <w:rPr>
+          <w:sz w:val="20"/>
+          <w:szCs w:val="20"/>
+        </w:rPr>
         <w:t>material</w:t>
       </w:r>
       <w:r>
         <w:rPr>
           <w:spacing w:val="-13"/>
-        </w:rPr>
-        <w:t xml:space="preserve"> </w:t>
-      </w:r>
-      <w:r>
+          <w:sz w:val="20"/>
+          <w:szCs w:val="20"/>
+        </w:rPr>
+        <w:t xml:space="preserve"> </w:t>
+      </w:r>
+      <w:r>
+        <w:rPr>
+          <w:sz w:val="20"/>
+          <w:szCs w:val="20"/>
+        </w:rPr>
         <w:t>and</w:t>
       </w:r>
       <w:r>
         <w:rPr>
           <w:spacing w:val="-15"/>
-        </w:rPr>
-        <w:t xml:space="preserve"> </w:t>
-      </w:r>
-      <w:r>
+          <w:sz w:val="20"/>
+          <w:szCs w:val="20"/>
+        </w:rPr>
+        <w:t xml:space="preserve"> </w:t>
+      </w:r>
+      <w:r>
+        <w:rPr>
+          <w:sz w:val="20"/>
+          <w:szCs w:val="20"/>
+        </w:rPr>
         <w:t>sources</w:t>
       </w:r>
       <w:r>
         <w:rPr>
           <w:spacing w:val="-16"/>
-        </w:rPr>
-        <w:t xml:space="preserve"> </w:t>
-      </w:r>
-      <w:r>
+          <w:sz w:val="20"/>
+          <w:szCs w:val="20"/>
+        </w:rPr>
+        <w:t xml:space="preserve"> </w:t>
+      </w:r>
+      <w:r>
+        <w:rPr>
+          <w:sz w:val="20"/>
+          <w:szCs w:val="20"/>
+        </w:rPr>
         <w:t>used</w:t>
       </w:r>
       <w:r>
         <w:rPr>
           <w:spacing w:val="-11"/>
-        </w:rPr>
-        <w:t xml:space="preserve"> </w:t>
-      </w:r>
-      <w:r>
+          <w:sz w:val="20"/>
+          <w:szCs w:val="20"/>
+        </w:rPr>
+        <w:t xml:space="preserve"> </w:t>
+      </w:r>
+      <w:r>
+        <w:rPr>
+          <w:sz w:val="20"/>
+          <w:szCs w:val="20"/>
+        </w:rPr>
         <w:t>in</w:t>
       </w:r>
       <w:r>
         <w:rPr>
           <w:spacing w:val="-12"/>
-        </w:rPr>
-        <w:t xml:space="preserve"> </w:t>
-      </w:r>
-      <w:r>
+          <w:sz w:val="20"/>
+          <w:szCs w:val="20"/>
+        </w:rPr>
+        <w:t xml:space="preserve"> </w:t>
+      </w:r>
+      <w:r>
+        <w:rPr>
+          <w:sz w:val="20"/>
+          <w:szCs w:val="20"/>
+        </w:rPr>
         <w:t>the</w:t>
       </w:r>
       <w:r>
         <w:rPr>
           <w:spacing w:val="-15"/>
-        </w:rPr>
-        <w:t xml:space="preserve"> </w:t>
-      </w:r>
-      <w:r>
+          <w:sz w:val="20"/>
+          <w:szCs w:val="20"/>
+        </w:rPr>
+        <w:t xml:space="preserve"> </w:t>
+      </w:r>
+      <w:r>
+        <w:rPr>
+          <w:sz w:val="20"/>
+          <w:szCs w:val="20"/>
+        </w:rPr>
         <w:t>preparation</w:t>
       </w:r>
       <w:r>
         <w:rPr>
           <w:spacing w:val="-14"/>
-        </w:rPr>
-        <w:t xml:space="preserve"> </w:t>
-      </w:r>
-      <w:r>
+          <w:sz w:val="20"/>
+          <w:szCs w:val="20"/>
+        </w:rPr>
+        <w:t xml:space="preserve"> </w:t>
+      </w:r>
+      <w:r>
+        <w:rPr>
+          <w:sz w:val="20"/>
+          <w:szCs w:val="20"/>
+        </w:rPr>
         <w:t>of</w:t>
       </w:r>
       <w:r>
         <w:rPr>
           <w:spacing w:val="-11"/>
-        </w:rPr>
-        <w:t xml:space="preserve"> </w:t>
-      </w:r>
-      <w:r>
+          <w:sz w:val="20"/>
+          <w:szCs w:val="20"/>
+        </w:rPr>
+        <w:t xml:space="preserve"> </w:t>
+      </w:r>
+      <w:r>
+        <w:rPr>
+          <w:sz w:val="20"/>
+          <w:szCs w:val="20"/>
+        </w:rPr>
         <w:t>this</w:t>
       </w:r>
       <w:r>
         <w:rPr>
           <w:spacing w:val="-14"/>
-        </w:rPr>
-        <w:t xml:space="preserve"> </w:t>
-      </w:r>
-      <w:r>
+          <w:sz w:val="20"/>
+          <w:szCs w:val="20"/>
+        </w:rPr>
+        <w:t xml:space="preserve"> </w:t>
+      </w:r>
+      <w:r>
+        <w:rPr>
+          <w:sz w:val="20"/>
+          <w:szCs w:val="20"/>
+        </w:rPr>
         <w:t>assignment including any material generated in the course of my employment.</w:t>
       </w:r>
     </w:p>
@@ -1025,82 +1302,136 @@
         </w:tabs>
         <w:spacing w:before="70"/>
         <w:ind w:hanging="364"/>
-      </w:pPr>
-      <w:r>
+        <w:rPr>
+          <w:sz w:val="20"/>
+          <w:szCs w:val="20"/>
+        </w:rPr>
+      </w:pPr>
+      <w:r>
+        <w:rPr>
+          <w:sz w:val="20"/>
+          <w:szCs w:val="20"/>
+        </w:rPr>
         <w:t>The</w:t>
       </w:r>
       <w:r>
         <w:rPr>
           <w:spacing w:val="-16"/>
-        </w:rPr>
-        <w:t xml:space="preserve"> </w:t>
-      </w:r>
-      <w:r>
+          <w:sz w:val="20"/>
+          <w:szCs w:val="20"/>
+        </w:rPr>
+        <w:t xml:space="preserve"> </w:t>
+      </w:r>
+      <w:r>
+        <w:rPr>
+          <w:sz w:val="20"/>
+          <w:szCs w:val="20"/>
+        </w:rPr>
         <w:t>assignment</w:t>
       </w:r>
       <w:r>
         <w:rPr>
           <w:spacing w:val="-15"/>
-        </w:rPr>
-        <w:t xml:space="preserve"> </w:t>
-      </w:r>
-      <w:r>
+          <w:sz w:val="20"/>
+          <w:szCs w:val="20"/>
+        </w:rPr>
+        <w:t xml:space="preserve"> </w:t>
+      </w:r>
+      <w:r>
+        <w:rPr>
+          <w:sz w:val="20"/>
+          <w:szCs w:val="20"/>
+        </w:rPr>
         <w:t>has</w:t>
       </w:r>
       <w:r>
         <w:rPr>
           <w:spacing w:val="-14"/>
-        </w:rPr>
-        <w:t xml:space="preserve"> </w:t>
-      </w:r>
-      <w:r>
+          <w:sz w:val="20"/>
+          <w:szCs w:val="20"/>
+        </w:rPr>
+        <w:t xml:space="preserve"> </w:t>
+      </w:r>
+      <w:r>
+        <w:rPr>
+          <w:sz w:val="20"/>
+          <w:szCs w:val="20"/>
+        </w:rPr>
         <w:t>not</w:t>
       </w:r>
       <w:r>
         <w:rPr>
           <w:spacing w:val="-16"/>
-        </w:rPr>
-        <w:t xml:space="preserve"> </w:t>
-      </w:r>
-      <w:r>
+          <w:sz w:val="20"/>
+          <w:szCs w:val="20"/>
+        </w:rPr>
+        <w:t xml:space="preserve"> </w:t>
+      </w:r>
+      <w:r>
+        <w:rPr>
+          <w:sz w:val="20"/>
+          <w:szCs w:val="20"/>
+        </w:rPr>
         <w:t>previously</w:t>
       </w:r>
       <w:r>
         <w:rPr>
           <w:spacing w:val="-13"/>
-        </w:rPr>
-        <w:t xml:space="preserve"> </w:t>
-      </w:r>
-      <w:r>
+          <w:sz w:val="20"/>
+          <w:szCs w:val="20"/>
+        </w:rPr>
+        <w:t xml:space="preserve"> </w:t>
+      </w:r>
+      <w:r>
+        <w:rPr>
+          <w:sz w:val="20"/>
+          <w:szCs w:val="20"/>
+        </w:rPr>
         <w:t>been</w:t>
       </w:r>
       <w:r>
         <w:rPr>
           <w:spacing w:val="-10"/>
-        </w:rPr>
-        <w:t xml:space="preserve"> </w:t>
-      </w:r>
-      <w:r>
+          <w:sz w:val="20"/>
+          <w:szCs w:val="20"/>
+        </w:rPr>
+        <w:t xml:space="preserve"> </w:t>
+      </w:r>
+      <w:r>
+        <w:rPr>
+          <w:sz w:val="20"/>
+          <w:szCs w:val="20"/>
+        </w:rPr>
         <w:t>submitted</w:t>
       </w:r>
       <w:r>
         <w:rPr>
           <w:spacing w:val="-13"/>
-        </w:rPr>
-        <w:t xml:space="preserve"> </w:t>
-      </w:r>
-      <w:r>
+          <w:sz w:val="20"/>
+          <w:szCs w:val="20"/>
+        </w:rPr>
+        <w:t xml:space="preserve"> </w:t>
+      </w:r>
+      <w:r>
+        <w:rPr>
+          <w:sz w:val="20"/>
+          <w:szCs w:val="20"/>
+        </w:rPr>
         <w:t>for</w:t>
       </w:r>
       <w:r>
         <w:rPr>
           <w:spacing w:val="-18"/>
+          <w:sz w:val="20"/>
+          <w:szCs w:val="20"/>
         </w:rPr>
         <w:t xml:space="preserve"> </w:t>
       </w:r>
       <w:r>
         <w:rPr>
           <w:spacing w:val="-2"/>
+          <w:sz w:val="20"/>
+          <w:szCs w:val="20"/>
         </w:rPr>
         <w:t>assessment.</w:t>
       </w:r>
@@ -1117,156 +1448,258 @@
         </w:tabs>
         <w:spacing w:before="74"/>
         <w:ind w:hanging="364"/>
-      </w:pPr>
-      <w:r>
+        <w:rPr>
+          <w:sz w:val="20"/>
+          <w:szCs w:val="20"/>
+        </w:rPr>
+      </w:pPr>
+      <w:r>
+        <w:rPr>
+          <w:sz w:val="20"/>
+          <w:szCs w:val="20"/>
+        </w:rPr>
         <w:t>I</w:t>
       </w:r>
       <w:r>
         <w:rPr>
           <w:spacing w:val="-18"/>
-        </w:rPr>
-        <w:t xml:space="preserve"> </w:t>
-      </w:r>
-      <w:r>
+          <w:sz w:val="20"/>
+          <w:szCs w:val="20"/>
+        </w:rPr>
+        <w:t xml:space="preserve"> </w:t>
+      </w:r>
+      <w:r>
+        <w:rPr>
+          <w:sz w:val="20"/>
+          <w:szCs w:val="20"/>
+        </w:rPr>
         <w:t>have</w:t>
       </w:r>
       <w:r>
         <w:rPr>
           <w:spacing w:val="-15"/>
-        </w:rPr>
-        <w:t xml:space="preserve"> </w:t>
-      </w:r>
-      <w:r>
+          <w:sz w:val="20"/>
+          <w:szCs w:val="20"/>
+        </w:rPr>
+        <w:t xml:space="preserve"> </w:t>
+      </w:r>
+      <w:r>
+        <w:rPr>
+          <w:sz w:val="20"/>
+          <w:szCs w:val="20"/>
+        </w:rPr>
         <w:t>not</w:t>
       </w:r>
       <w:r>
         <w:rPr>
           <w:spacing w:val="-15"/>
-        </w:rPr>
-        <w:t xml:space="preserve"> </w:t>
-      </w:r>
-      <w:r>
+          <w:sz w:val="20"/>
+          <w:szCs w:val="20"/>
+        </w:rPr>
+        <w:t xml:space="preserve"> </w:t>
+      </w:r>
+      <w:r>
+        <w:rPr>
+          <w:sz w:val="20"/>
+          <w:szCs w:val="20"/>
+        </w:rPr>
         <w:t>copied</w:t>
       </w:r>
       <w:r>
         <w:rPr>
           <w:spacing w:val="-16"/>
-        </w:rPr>
-        <w:t xml:space="preserve"> </w:t>
-      </w:r>
-      <w:r>
+          <w:sz w:val="20"/>
+          <w:szCs w:val="20"/>
+        </w:rPr>
+        <w:t xml:space="preserve"> </w:t>
+      </w:r>
+      <w:r>
+        <w:rPr>
+          <w:sz w:val="20"/>
+          <w:szCs w:val="20"/>
+        </w:rPr>
         <w:t>in</w:t>
       </w:r>
       <w:r>
         <w:rPr>
           <w:spacing w:val="-14"/>
-        </w:rPr>
-        <w:t xml:space="preserve"> </w:t>
-      </w:r>
-      <w:r>
+          <w:sz w:val="20"/>
+          <w:szCs w:val="20"/>
+        </w:rPr>
+        <w:t xml:space="preserve"> </w:t>
+      </w:r>
+      <w:r>
+        <w:rPr>
+          <w:sz w:val="20"/>
+          <w:szCs w:val="20"/>
+        </w:rPr>
         <w:t>part</w:t>
       </w:r>
       <w:r>
         <w:rPr>
           <w:spacing w:val="-16"/>
-        </w:rPr>
-        <w:t xml:space="preserve"> </w:t>
-      </w:r>
-      <w:r>
+          <w:sz w:val="20"/>
+          <w:szCs w:val="20"/>
+        </w:rPr>
+        <w:t xml:space="preserve"> </w:t>
+      </w:r>
+      <w:r>
+        <w:rPr>
+          <w:sz w:val="20"/>
+          <w:szCs w:val="20"/>
+        </w:rPr>
         <w:t>or</w:t>
       </w:r>
       <w:r>
         <w:rPr>
           <w:spacing w:val="-10"/>
-        </w:rPr>
-        <w:t xml:space="preserve"> </w:t>
-      </w:r>
-      <w:r>
+          <w:sz w:val="20"/>
+          <w:szCs w:val="20"/>
+        </w:rPr>
+        <w:t xml:space="preserve"> </w:t>
+      </w:r>
+      <w:r>
+        <w:rPr>
+          <w:sz w:val="20"/>
+          <w:szCs w:val="20"/>
+        </w:rPr>
         <w:t>in</w:t>
       </w:r>
       <w:r>
         <w:rPr>
           <w:spacing w:val="-14"/>
-        </w:rPr>
-        <w:t xml:space="preserve"> </w:t>
-      </w:r>
-      <w:r>
+          <w:sz w:val="20"/>
+          <w:szCs w:val="20"/>
+        </w:rPr>
+        <w:t xml:space="preserve"> </w:t>
+      </w:r>
+      <w:r>
+        <w:rPr>
+          <w:sz w:val="20"/>
+          <w:szCs w:val="20"/>
+        </w:rPr>
         <w:t>whole</w:t>
       </w:r>
       <w:r>
         <w:rPr>
           <w:spacing w:val="-15"/>
-        </w:rPr>
-        <w:t xml:space="preserve"> </w:t>
-      </w:r>
-      <w:r>
+          <w:sz w:val="20"/>
+          <w:szCs w:val="20"/>
+        </w:rPr>
+        <w:t xml:space="preserve"> </w:t>
+      </w:r>
+      <w:r>
+        <w:rPr>
+          <w:sz w:val="20"/>
+          <w:szCs w:val="20"/>
+        </w:rPr>
         <w:t>or</w:t>
       </w:r>
       <w:r>
         <w:rPr>
           <w:spacing w:val="-13"/>
-        </w:rPr>
-        <w:t xml:space="preserve"> </w:t>
-      </w:r>
-      <w:r>
+          <w:sz w:val="20"/>
+          <w:szCs w:val="20"/>
+        </w:rPr>
+        <w:t xml:space="preserve"> </w:t>
+      </w:r>
+      <w:r>
+        <w:rPr>
+          <w:sz w:val="20"/>
+          <w:szCs w:val="20"/>
+        </w:rPr>
         <w:t>otherwise</w:t>
       </w:r>
       <w:r>
         <w:rPr>
           <w:spacing w:val="-15"/>
+          <w:sz w:val="20"/>
+          <w:szCs w:val="20"/>
         </w:rPr>
         <w:t xml:space="preserve"> </w:t>
       </w:r>
       <w:proofErr w:type="spellStart"/>
       <w:r>
+        <w:rPr>
+          <w:sz w:val="20"/>
+          <w:szCs w:val="20"/>
+        </w:rPr>
         <w:t>plagiarised</w:t>
       </w:r>
       <w:proofErr w:type="spellEnd"/>
       <w:r>
         <w:rPr>
           <w:spacing w:val="-14"/>
-        </w:rPr>
-        <w:t xml:space="preserve"> </w:t>
-      </w:r>
-      <w:r>
+          <w:sz w:val="20"/>
+          <w:szCs w:val="20"/>
+        </w:rPr>
+        <w:t xml:space="preserve"> </w:t>
+      </w:r>
+      <w:r>
+        <w:rPr>
+          <w:sz w:val="20"/>
+          <w:szCs w:val="20"/>
+        </w:rPr>
         <w:t>the</w:t>
       </w:r>
       <w:r>
         <w:rPr>
           <w:spacing w:val="-13"/>
-        </w:rPr>
-        <w:t xml:space="preserve"> </w:t>
-      </w:r>
-      <w:r>
+          <w:sz w:val="20"/>
+          <w:szCs w:val="20"/>
+        </w:rPr>
+        <w:t xml:space="preserve"> </w:t>
+      </w:r>
+      <w:r>
+        <w:rPr>
+          <w:sz w:val="20"/>
+          <w:szCs w:val="20"/>
+        </w:rPr>
         <w:t>work</w:t>
       </w:r>
       <w:r>
         <w:rPr>
           <w:spacing w:val="-15"/>
-        </w:rPr>
-        <w:t xml:space="preserve"> </w:t>
-      </w:r>
-      <w:r>
+          <w:sz w:val="20"/>
+          <w:szCs w:val="20"/>
+        </w:rPr>
+        <w:t xml:space="preserve"> </w:t>
+      </w:r>
+      <w:r>
+        <w:rPr>
+          <w:sz w:val="20"/>
+          <w:szCs w:val="20"/>
+        </w:rPr>
         <w:t>of</w:t>
       </w:r>
       <w:r>
         <w:rPr>
           <w:spacing w:val="-16"/>
-        </w:rPr>
-        <w:t xml:space="preserve"> </w:t>
-      </w:r>
-      <w:r>
+          <w:sz w:val="20"/>
+          <w:szCs w:val="20"/>
+        </w:rPr>
+        <w:t xml:space="preserve"> </w:t>
+      </w:r>
+      <w:r>
+        <w:rPr>
+          <w:sz w:val="20"/>
+          <w:szCs w:val="20"/>
+        </w:rPr>
         <w:t>other</w:t>
       </w:r>
       <w:r>
         <w:rPr>
           <w:spacing w:val="1"/>
+          <w:sz w:val="20"/>
+          <w:szCs w:val="20"/>
         </w:rPr>
         <w:t xml:space="preserve"> </w:t>
       </w:r>
       <w:r>
         <w:rPr>
           <w:spacing w:val="-2"/>
+          <w:sz w:val="20"/>
+          <w:szCs w:val="20"/>
         </w:rPr>
         <w:t>students.</w:t>
       </w:r>
@@ -1283,100 +1716,166 @@
         </w:tabs>
         <w:spacing w:before="73"/>
         <w:ind w:hanging="364"/>
-      </w:pPr>
-      <w:r>
+        <w:rPr>
+          <w:sz w:val="20"/>
+          <w:szCs w:val="20"/>
+        </w:rPr>
+      </w:pPr>
+      <w:r>
+        <w:rPr>
+          <w:sz w:val="20"/>
+          <w:szCs w:val="20"/>
+        </w:rPr>
         <w:t>I</w:t>
       </w:r>
       <w:r>
         <w:rPr>
           <w:spacing w:val="-16"/>
-        </w:rPr>
-        <w:t xml:space="preserve"> </w:t>
-      </w:r>
-      <w:r>
+          <w:sz w:val="20"/>
+          <w:szCs w:val="20"/>
+        </w:rPr>
+        <w:t xml:space="preserve"> </w:t>
+      </w:r>
+      <w:r>
+        <w:rPr>
+          <w:sz w:val="20"/>
+          <w:szCs w:val="20"/>
+        </w:rPr>
         <w:t>have</w:t>
       </w:r>
       <w:r>
         <w:rPr>
           <w:spacing w:val="-13"/>
-        </w:rPr>
-        <w:t xml:space="preserve"> </w:t>
-      </w:r>
-      <w:r>
+          <w:sz w:val="20"/>
+          <w:szCs w:val="20"/>
+        </w:rPr>
+        <w:t xml:space="preserve"> </w:t>
+      </w:r>
+      <w:r>
+        <w:rPr>
+          <w:sz w:val="20"/>
+          <w:szCs w:val="20"/>
+        </w:rPr>
         <w:t>read</w:t>
       </w:r>
       <w:r>
         <w:rPr>
           <w:spacing w:val="-10"/>
-        </w:rPr>
-        <w:t xml:space="preserve"> </w:t>
-      </w:r>
-      <w:r>
+          <w:sz w:val="20"/>
+          <w:szCs w:val="20"/>
+        </w:rPr>
+        <w:t xml:space="preserve"> </w:t>
+      </w:r>
+      <w:r>
+        <w:rPr>
+          <w:sz w:val="20"/>
+          <w:szCs w:val="20"/>
+        </w:rPr>
         <w:t>and</w:t>
       </w:r>
       <w:r>
         <w:rPr>
           <w:spacing w:val="-9"/>
-        </w:rPr>
-        <w:t xml:space="preserve"> </w:t>
-      </w:r>
-      <w:r>
+          <w:sz w:val="20"/>
+          <w:szCs w:val="20"/>
+        </w:rPr>
+        <w:t xml:space="preserve"> </w:t>
+      </w:r>
+      <w:r>
+        <w:rPr>
+          <w:sz w:val="20"/>
+          <w:szCs w:val="20"/>
+        </w:rPr>
         <w:t>I</w:t>
       </w:r>
       <w:r>
         <w:rPr>
           <w:spacing w:val="-9"/>
-        </w:rPr>
-        <w:t xml:space="preserve"> </w:t>
-      </w:r>
-      <w:r>
+          <w:sz w:val="20"/>
+          <w:szCs w:val="20"/>
+        </w:rPr>
+        <w:t xml:space="preserve"> </w:t>
+      </w:r>
+      <w:r>
+        <w:rPr>
+          <w:sz w:val="20"/>
+          <w:szCs w:val="20"/>
+        </w:rPr>
         <w:t>understand</w:t>
       </w:r>
       <w:r>
         <w:rPr>
           <w:spacing w:val="-7"/>
-        </w:rPr>
-        <w:t xml:space="preserve"> </w:t>
-      </w:r>
-      <w:r>
+          <w:sz w:val="20"/>
+          <w:szCs w:val="20"/>
+        </w:rPr>
+        <w:t xml:space="preserve"> </w:t>
+      </w:r>
+      <w:r>
+        <w:rPr>
+          <w:sz w:val="20"/>
+          <w:szCs w:val="20"/>
+        </w:rPr>
         <w:t>the</w:t>
       </w:r>
       <w:r>
         <w:rPr>
           <w:spacing w:val="-11"/>
-        </w:rPr>
-        <w:t xml:space="preserve"> </w:t>
-      </w:r>
-      <w:r>
+          <w:sz w:val="20"/>
+          <w:szCs w:val="20"/>
+        </w:rPr>
+        <w:t xml:space="preserve"> </w:t>
+      </w:r>
+      <w:r>
+        <w:rPr>
+          <w:sz w:val="20"/>
+          <w:szCs w:val="20"/>
+        </w:rPr>
         <w:t>criteria</w:t>
       </w:r>
       <w:r>
         <w:rPr>
           <w:spacing w:val="-7"/>
-        </w:rPr>
-        <w:t xml:space="preserve"> </w:t>
-      </w:r>
-      <w:r>
+          <w:sz w:val="20"/>
+          <w:szCs w:val="20"/>
+        </w:rPr>
+        <w:t xml:space="preserve"> </w:t>
+      </w:r>
+      <w:r>
+        <w:rPr>
+          <w:sz w:val="20"/>
+          <w:szCs w:val="20"/>
+        </w:rPr>
         <w:t>used</w:t>
       </w:r>
       <w:r>
         <w:rPr>
           <w:spacing w:val="-10"/>
-        </w:rPr>
-        <w:t xml:space="preserve"> </w:t>
-      </w:r>
-      <w:r>
+          <w:sz w:val="20"/>
+          <w:szCs w:val="20"/>
+        </w:rPr>
+        <w:t xml:space="preserve"> </w:t>
+      </w:r>
+      <w:r>
+        <w:rPr>
+          <w:sz w:val="20"/>
+          <w:szCs w:val="20"/>
+        </w:rPr>
         <w:t>for</w:t>
       </w:r>
       <w:r>
         <w:rPr>
           <w:spacing w:val="-18"/>
+          <w:sz w:val="20"/>
+          <w:szCs w:val="20"/>
         </w:rPr>
         <w:t xml:space="preserve"> </w:t>
       </w:r>
       <w:r>
         <w:rPr>
           <w:spacing w:val="-2"/>
+          <w:sz w:val="20"/>
+          <w:szCs w:val="20"/>
         </w:rPr>
         <w:t>assessment.</w:t>
       </w:r>
@@ -1393,127 +1892,211 @@
         </w:tabs>
         <w:spacing w:before="69"/>
         <w:ind w:left="1051" w:hanging="362"/>
-      </w:pPr>
-      <w:r>
+        <w:rPr>
+          <w:sz w:val="20"/>
+          <w:szCs w:val="20"/>
+        </w:rPr>
+      </w:pPr>
+      <w:r>
+        <w:rPr>
+          <w:sz w:val="20"/>
+          <w:szCs w:val="20"/>
+        </w:rPr>
         <w:t>The</w:t>
       </w:r>
       <w:r>
         <w:rPr>
           <w:spacing w:val="-18"/>
-        </w:rPr>
-        <w:t xml:space="preserve"> </w:t>
-      </w:r>
-      <w:r>
+          <w:sz w:val="20"/>
+          <w:szCs w:val="20"/>
+        </w:rPr>
+        <w:t xml:space="preserve"> </w:t>
+      </w:r>
+      <w:r>
+        <w:rPr>
+          <w:sz w:val="20"/>
+          <w:szCs w:val="20"/>
+        </w:rPr>
         <w:t>assignment</w:t>
       </w:r>
       <w:r>
         <w:rPr>
           <w:spacing w:val="-15"/>
-        </w:rPr>
-        <w:t xml:space="preserve"> </w:t>
-      </w:r>
-      <w:r>
+          <w:sz w:val="20"/>
+          <w:szCs w:val="20"/>
+        </w:rPr>
+        <w:t xml:space="preserve"> </w:t>
+      </w:r>
+      <w:r>
+        <w:rPr>
+          <w:sz w:val="20"/>
+          <w:szCs w:val="20"/>
+        </w:rPr>
         <w:t>is</w:t>
       </w:r>
       <w:r>
         <w:rPr>
           <w:spacing w:val="-14"/>
-        </w:rPr>
-        <w:t xml:space="preserve"> </w:t>
-      </w:r>
-      <w:r>
+          <w:sz w:val="20"/>
+          <w:szCs w:val="20"/>
+        </w:rPr>
+        <w:t xml:space="preserve"> </w:t>
+      </w:r>
+      <w:r>
+        <w:rPr>
+          <w:sz w:val="20"/>
+          <w:szCs w:val="20"/>
+        </w:rPr>
         <w:t>within</w:t>
       </w:r>
       <w:r>
         <w:rPr>
           <w:spacing w:val="-16"/>
-        </w:rPr>
-        <w:t xml:space="preserve"> </w:t>
-      </w:r>
-      <w:r>
+          <w:sz w:val="20"/>
+          <w:szCs w:val="20"/>
+        </w:rPr>
+        <w:t xml:space="preserve"> </w:t>
+      </w:r>
+      <w:r>
+        <w:rPr>
+          <w:sz w:val="20"/>
+          <w:szCs w:val="20"/>
+        </w:rPr>
         <w:t>the</w:t>
       </w:r>
       <w:r>
         <w:rPr>
           <w:spacing w:val="-11"/>
-        </w:rPr>
-        <w:t xml:space="preserve"> </w:t>
-      </w:r>
-      <w:r>
+          <w:sz w:val="20"/>
+          <w:szCs w:val="20"/>
+        </w:rPr>
+        <w:t xml:space="preserve"> </w:t>
+      </w:r>
+      <w:r>
+        <w:rPr>
+          <w:sz w:val="20"/>
+          <w:szCs w:val="20"/>
+        </w:rPr>
         <w:t>word</w:t>
       </w:r>
       <w:r>
         <w:rPr>
           <w:spacing w:val="-15"/>
-        </w:rPr>
-        <w:t xml:space="preserve"> </w:t>
-      </w:r>
-      <w:r>
+          <w:sz w:val="20"/>
+          <w:szCs w:val="20"/>
+        </w:rPr>
+        <w:t xml:space="preserve"> </w:t>
+      </w:r>
+      <w:r>
+        <w:rPr>
+          <w:sz w:val="20"/>
+          <w:szCs w:val="20"/>
+        </w:rPr>
         <w:t>and</w:t>
       </w:r>
       <w:r>
         <w:rPr>
           <w:spacing w:val="-12"/>
-        </w:rPr>
-        <w:t xml:space="preserve"> </w:t>
-      </w:r>
-      <w:r>
+          <w:sz w:val="20"/>
+          <w:szCs w:val="20"/>
+        </w:rPr>
+        <w:t xml:space="preserve"> </w:t>
+      </w:r>
+      <w:r>
+        <w:rPr>
+          <w:sz w:val="20"/>
+          <w:szCs w:val="20"/>
+        </w:rPr>
         <w:t>page</w:t>
       </w:r>
       <w:r>
         <w:rPr>
           <w:spacing w:val="-11"/>
-        </w:rPr>
-        <w:t xml:space="preserve"> </w:t>
-      </w:r>
-      <w:r>
+          <w:sz w:val="20"/>
+          <w:szCs w:val="20"/>
+        </w:rPr>
+        <w:t xml:space="preserve"> </w:t>
+      </w:r>
+      <w:r>
+        <w:rPr>
+          <w:sz w:val="20"/>
+          <w:szCs w:val="20"/>
+        </w:rPr>
         <w:t>limits</w:t>
       </w:r>
       <w:r>
         <w:rPr>
           <w:spacing w:val="-12"/>
-        </w:rPr>
-        <w:t xml:space="preserve"> </w:t>
-      </w:r>
-      <w:r>
+          <w:sz w:val="20"/>
+          <w:szCs w:val="20"/>
+        </w:rPr>
+        <w:t xml:space="preserve"> </w:t>
+      </w:r>
+      <w:r>
+        <w:rPr>
+          <w:sz w:val="20"/>
+          <w:szCs w:val="20"/>
+        </w:rPr>
         <w:t>specified</w:t>
       </w:r>
       <w:r>
         <w:rPr>
           <w:spacing w:val="-12"/>
-        </w:rPr>
-        <w:t xml:space="preserve"> </w:t>
-      </w:r>
-      <w:r>
+          <w:sz w:val="20"/>
+          <w:szCs w:val="20"/>
+        </w:rPr>
+        <w:t xml:space="preserve"> </w:t>
+      </w:r>
+      <w:r>
+        <w:rPr>
+          <w:sz w:val="20"/>
+          <w:szCs w:val="20"/>
+        </w:rPr>
         <w:t>in</w:t>
       </w:r>
       <w:r>
         <w:rPr>
           <w:spacing w:val="-12"/>
-        </w:rPr>
-        <w:t xml:space="preserve"> </w:t>
-      </w:r>
-      <w:r>
+          <w:sz w:val="20"/>
+          <w:szCs w:val="20"/>
+        </w:rPr>
+        <w:t xml:space="preserve"> </w:t>
+      </w:r>
+      <w:r>
+        <w:rPr>
+          <w:sz w:val="20"/>
+          <w:szCs w:val="20"/>
+        </w:rPr>
         <w:t>the</w:t>
       </w:r>
       <w:r>
         <w:rPr>
           <w:spacing w:val="-10"/>
-        </w:rPr>
-        <w:t xml:space="preserve"> </w:t>
-      </w:r>
-      <w:r>
+          <w:sz w:val="20"/>
+          <w:szCs w:val="20"/>
+        </w:rPr>
+        <w:t xml:space="preserve"> </w:t>
+      </w:r>
+      <w:r>
+        <w:rPr>
+          <w:sz w:val="20"/>
+          <w:szCs w:val="20"/>
+        </w:rPr>
         <w:t>unit</w:t>
       </w:r>
       <w:r>
         <w:rPr>
           <w:spacing w:val="-15"/>
+          <w:sz w:val="20"/>
+          <w:szCs w:val="20"/>
         </w:rPr>
         <w:t xml:space="preserve"> </w:t>
       </w:r>
       <w:r>
         <w:rPr>
           <w:spacing w:val="-2"/>
+          <w:sz w:val="20"/>
+          <w:szCs w:val="20"/>
         </w:rPr>
         <w:t>outline.</w:t>
       </w:r>
@@ -1530,134 +2113,226 @@
         </w:tabs>
         <w:spacing w:before="78"/>
         <w:ind w:right="581"/>
-      </w:pPr>
-      <w:r>
+        <w:rPr>
+          <w:sz w:val="20"/>
+          <w:szCs w:val="20"/>
+        </w:rPr>
+      </w:pPr>
+      <w:r>
+        <w:rPr>
+          <w:sz w:val="20"/>
+          <w:szCs w:val="20"/>
+        </w:rPr>
         <w:t>The</w:t>
       </w:r>
       <w:r>
         <w:rPr>
           <w:spacing w:val="-16"/>
-        </w:rPr>
-        <w:t xml:space="preserve"> </w:t>
-      </w:r>
-      <w:r>
+          <w:sz w:val="20"/>
+          <w:szCs w:val="20"/>
+        </w:rPr>
+        <w:t xml:space="preserve"> </w:t>
+      </w:r>
+      <w:r>
+        <w:rPr>
+          <w:sz w:val="20"/>
+          <w:szCs w:val="20"/>
+        </w:rPr>
         <w:t>use</w:t>
       </w:r>
       <w:r>
         <w:rPr>
           <w:spacing w:val="-15"/>
-        </w:rPr>
-        <w:t xml:space="preserve"> </w:t>
-      </w:r>
-      <w:r>
+          <w:sz w:val="20"/>
+          <w:szCs w:val="20"/>
+        </w:rPr>
+        <w:t xml:space="preserve"> </w:t>
+      </w:r>
+      <w:r>
+        <w:rPr>
+          <w:sz w:val="20"/>
+          <w:szCs w:val="20"/>
+        </w:rPr>
         <w:t>of</w:t>
       </w:r>
       <w:r>
         <w:rPr>
           <w:spacing w:val="-6"/>
-        </w:rPr>
-        <w:t xml:space="preserve"> </w:t>
-      </w:r>
-      <w:r>
+          <w:sz w:val="20"/>
+          <w:szCs w:val="20"/>
+        </w:rPr>
+        <w:t xml:space="preserve"> </w:t>
+      </w:r>
+      <w:r>
+        <w:rPr>
+          <w:sz w:val="20"/>
+          <w:szCs w:val="20"/>
+        </w:rPr>
         <w:t>any</w:t>
       </w:r>
       <w:r>
         <w:rPr>
           <w:spacing w:val="-16"/>
-        </w:rPr>
-        <w:t xml:space="preserve"> </w:t>
-      </w:r>
-      <w:r>
+          <w:sz w:val="20"/>
+          <w:szCs w:val="20"/>
+        </w:rPr>
+        <w:t xml:space="preserve"> </w:t>
+      </w:r>
+      <w:r>
+        <w:rPr>
+          <w:sz w:val="20"/>
+          <w:szCs w:val="20"/>
+        </w:rPr>
         <w:t>material</w:t>
       </w:r>
       <w:r>
         <w:rPr>
           <w:spacing w:val="-9"/>
-        </w:rPr>
-        <w:t xml:space="preserve"> </w:t>
-      </w:r>
-      <w:r>
+          <w:sz w:val="20"/>
+          <w:szCs w:val="20"/>
+        </w:rPr>
+        <w:t xml:space="preserve"> </w:t>
+      </w:r>
+      <w:r>
+        <w:rPr>
+          <w:sz w:val="20"/>
+          <w:szCs w:val="20"/>
+        </w:rPr>
         <w:t>in</w:t>
       </w:r>
       <w:r>
         <w:rPr>
           <w:spacing w:val="-10"/>
-        </w:rPr>
-        <w:t xml:space="preserve"> </w:t>
-      </w:r>
-      <w:r>
+          <w:sz w:val="20"/>
+          <w:szCs w:val="20"/>
+        </w:rPr>
+        <w:t xml:space="preserve"> </w:t>
+      </w:r>
+      <w:r>
+        <w:rPr>
+          <w:sz w:val="20"/>
+          <w:szCs w:val="20"/>
+        </w:rPr>
         <w:t>this</w:t>
       </w:r>
       <w:r>
         <w:rPr>
           <w:spacing w:val="-11"/>
-        </w:rPr>
-        <w:t xml:space="preserve"> </w:t>
-      </w:r>
-      <w:r>
+          <w:sz w:val="20"/>
+          <w:szCs w:val="20"/>
+        </w:rPr>
+        <w:t xml:space="preserve"> </w:t>
+      </w:r>
+      <w:r>
+        <w:rPr>
+          <w:sz w:val="20"/>
+          <w:szCs w:val="20"/>
+        </w:rPr>
         <w:t>assignment</w:t>
       </w:r>
       <w:r>
         <w:rPr>
           <w:spacing w:val="-5"/>
-        </w:rPr>
-        <w:t xml:space="preserve"> </w:t>
-      </w:r>
-      <w:r>
+          <w:sz w:val="20"/>
+          <w:szCs w:val="20"/>
+        </w:rPr>
+        <w:t xml:space="preserve"> </w:t>
+      </w:r>
+      <w:r>
+        <w:rPr>
+          <w:sz w:val="20"/>
+          <w:szCs w:val="20"/>
+        </w:rPr>
         <w:t>does</w:t>
       </w:r>
       <w:r>
         <w:rPr>
           <w:spacing w:val="-11"/>
-        </w:rPr>
-        <w:t xml:space="preserve"> </w:t>
-      </w:r>
-      <w:r>
+          <w:sz w:val="20"/>
+          <w:szCs w:val="20"/>
+        </w:rPr>
+        <w:t xml:space="preserve"> </w:t>
+      </w:r>
+      <w:r>
+        <w:rPr>
+          <w:sz w:val="20"/>
+          <w:szCs w:val="20"/>
+        </w:rPr>
         <w:t>not</w:t>
       </w:r>
       <w:r>
         <w:rPr>
           <w:spacing w:val="-10"/>
-        </w:rPr>
-        <w:t xml:space="preserve"> </w:t>
-      </w:r>
-      <w:r>
+          <w:sz w:val="20"/>
+          <w:szCs w:val="20"/>
+        </w:rPr>
+        <w:t xml:space="preserve"> </w:t>
+      </w:r>
+      <w:r>
+        <w:rPr>
+          <w:sz w:val="20"/>
+          <w:szCs w:val="20"/>
+        </w:rPr>
         <w:t>infringe</w:t>
       </w:r>
       <w:r>
         <w:rPr>
           <w:spacing w:val="-15"/>
-        </w:rPr>
-        <w:t xml:space="preserve"> </w:t>
-      </w:r>
-      <w:r>
+          <w:sz w:val="20"/>
+          <w:szCs w:val="20"/>
+        </w:rPr>
+        <w:t xml:space="preserve"> </w:t>
+      </w:r>
+      <w:r>
+        <w:rPr>
+          <w:sz w:val="20"/>
+          <w:szCs w:val="20"/>
+        </w:rPr>
         <w:t>the</w:t>
       </w:r>
       <w:r>
         <w:rPr>
           <w:spacing w:val="-14"/>
-        </w:rPr>
-        <w:t xml:space="preserve"> </w:t>
-      </w:r>
-      <w:r>
+          <w:sz w:val="20"/>
+          <w:szCs w:val="20"/>
+        </w:rPr>
+        <w:t xml:space="preserve"> </w:t>
+      </w:r>
+      <w:r>
+        <w:rPr>
+          <w:sz w:val="20"/>
+          <w:szCs w:val="20"/>
+        </w:rPr>
         <w:t>intellectual</w:t>
       </w:r>
       <w:r>
         <w:rPr>
           <w:spacing w:val="-16"/>
-        </w:rPr>
-        <w:t xml:space="preserve"> </w:t>
-      </w:r>
-      <w:r>
+          <w:sz w:val="20"/>
+          <w:szCs w:val="20"/>
+        </w:rPr>
+        <w:t xml:space="preserve"> </w:t>
+      </w:r>
+      <w:r>
+        <w:rPr>
+          <w:sz w:val="20"/>
+          <w:szCs w:val="20"/>
+        </w:rPr>
         <w:t>property</w:t>
       </w:r>
       <w:r>
         <w:rPr>
           <w:spacing w:val="-16"/>
-        </w:rPr>
-        <w:t xml:space="preserve"> </w:t>
-      </w:r>
-      <w:r>
+          <w:sz w:val="20"/>
+          <w:szCs w:val="20"/>
+        </w:rPr>
+        <w:t xml:space="preserve"> </w:t>
+      </w:r>
+      <w:r>
+        <w:rPr>
+          <w:sz w:val="20"/>
+          <w:szCs w:val="20"/>
+        </w:rPr>
         <w:t>/ copyright of a third party.</w:t>
       </w:r>
     </w:p>
@@ -1674,179 +2349,301 @@
         <w:spacing w:before="70"/>
         <w:ind w:left="1051" w:right="433" w:hanging="360"/>
         <w:jc w:val="both"/>
-      </w:pPr>
-      <w:r>
+        <w:rPr>
+          <w:sz w:val="20"/>
+          <w:szCs w:val="20"/>
+        </w:rPr>
+      </w:pPr>
+      <w:r>
+        <w:rPr>
+          <w:sz w:val="20"/>
+          <w:szCs w:val="20"/>
+        </w:rPr>
         <w:t>I</w:t>
       </w:r>
       <w:r>
         <w:rPr>
           <w:spacing w:val="-16"/>
-        </w:rPr>
-        <w:t xml:space="preserve"> </w:t>
-      </w:r>
-      <w:r>
+          <w:sz w:val="20"/>
+          <w:szCs w:val="20"/>
+        </w:rPr>
+        <w:t xml:space="preserve"> </w:t>
+      </w:r>
+      <w:r>
+        <w:rPr>
+          <w:sz w:val="20"/>
+          <w:szCs w:val="20"/>
+        </w:rPr>
         <w:t>understand</w:t>
       </w:r>
       <w:r>
         <w:rPr>
           <w:spacing w:val="-15"/>
-        </w:rPr>
-        <w:t xml:space="preserve"> </w:t>
-      </w:r>
-      <w:r>
+          <w:sz w:val="20"/>
+          <w:szCs w:val="20"/>
+        </w:rPr>
+        <w:t xml:space="preserve"> </w:t>
+      </w:r>
+      <w:r>
+        <w:rPr>
+          <w:sz w:val="20"/>
+          <w:szCs w:val="20"/>
+        </w:rPr>
         <w:t>that</w:t>
       </w:r>
       <w:r>
         <w:rPr>
           <w:spacing w:val="-15"/>
-        </w:rPr>
-        <w:t xml:space="preserve"> </w:t>
-      </w:r>
-      <w:r>
+          <w:sz w:val="20"/>
+          <w:szCs w:val="20"/>
+        </w:rPr>
+        <w:t xml:space="preserve"> </w:t>
+      </w:r>
+      <w:r>
+        <w:rPr>
+          <w:sz w:val="20"/>
+          <w:szCs w:val="20"/>
+        </w:rPr>
         <w:t>this</w:t>
       </w:r>
       <w:r>
         <w:rPr>
           <w:spacing w:val="-16"/>
-        </w:rPr>
-        <w:t xml:space="preserve"> </w:t>
-      </w:r>
-      <w:r>
+          <w:sz w:val="20"/>
+          <w:szCs w:val="20"/>
+        </w:rPr>
+        <w:t xml:space="preserve"> </w:t>
+      </w:r>
+      <w:r>
+        <w:rPr>
+          <w:sz w:val="20"/>
+          <w:szCs w:val="20"/>
+        </w:rPr>
         <w:t>assignment</w:t>
       </w:r>
       <w:r>
         <w:rPr>
           <w:spacing w:val="-15"/>
-        </w:rPr>
-        <w:t xml:space="preserve"> </w:t>
-      </w:r>
-      <w:r>
+          <w:sz w:val="20"/>
+          <w:szCs w:val="20"/>
+        </w:rPr>
+        <w:t xml:space="preserve"> </w:t>
+      </w:r>
+      <w:r>
+        <w:rPr>
+          <w:sz w:val="20"/>
+          <w:szCs w:val="20"/>
+        </w:rPr>
         <w:t>may</w:t>
       </w:r>
       <w:r>
         <w:rPr>
           <w:spacing w:val="-15"/>
-        </w:rPr>
-        <w:t xml:space="preserve"> </w:t>
-      </w:r>
-      <w:r>
+          <w:sz w:val="20"/>
+          <w:szCs w:val="20"/>
+        </w:rPr>
+        <w:t xml:space="preserve"> </w:t>
+      </w:r>
+      <w:r>
+        <w:rPr>
+          <w:sz w:val="20"/>
+          <w:szCs w:val="20"/>
+        </w:rPr>
         <w:t>undergo</w:t>
       </w:r>
       <w:r>
         <w:rPr>
           <w:spacing w:val="-15"/>
-        </w:rPr>
-        <w:t xml:space="preserve"> </w:t>
-      </w:r>
-      <w:r>
+          <w:sz w:val="20"/>
+          <w:szCs w:val="20"/>
+        </w:rPr>
+        <w:t xml:space="preserve"> </w:t>
+      </w:r>
+      <w:r>
+        <w:rPr>
+          <w:sz w:val="20"/>
+          <w:szCs w:val="20"/>
+        </w:rPr>
         <w:t>electronic</w:t>
       </w:r>
       <w:r>
         <w:rPr>
           <w:spacing w:val="-16"/>
-        </w:rPr>
-        <w:t xml:space="preserve"> </w:t>
-      </w:r>
-      <w:r>
+          <w:sz w:val="20"/>
+          <w:szCs w:val="20"/>
+        </w:rPr>
+        <w:t xml:space="preserve"> </w:t>
+      </w:r>
+      <w:r>
+        <w:rPr>
+          <w:sz w:val="20"/>
+          <w:szCs w:val="20"/>
+        </w:rPr>
         <w:t>detection</w:t>
       </w:r>
       <w:r>
         <w:rPr>
           <w:spacing w:val="-15"/>
-        </w:rPr>
-        <w:t xml:space="preserve"> </w:t>
-      </w:r>
-      <w:r>
+          <w:sz w:val="20"/>
+          <w:szCs w:val="20"/>
+        </w:rPr>
+        <w:t xml:space="preserve"> </w:t>
+      </w:r>
+      <w:r>
+        <w:rPr>
+          <w:sz w:val="20"/>
+          <w:szCs w:val="20"/>
+        </w:rPr>
         <w:t>for</w:t>
       </w:r>
       <w:r>
         <w:rPr>
           <w:spacing w:val="-11"/>
-        </w:rPr>
-        <w:t xml:space="preserve"> </w:t>
-      </w:r>
-      <w:r>
+          <w:sz w:val="20"/>
+          <w:szCs w:val="20"/>
+        </w:rPr>
+        <w:t xml:space="preserve"> </w:t>
+      </w:r>
+      <w:r>
+        <w:rPr>
+          <w:sz w:val="20"/>
+          <w:szCs w:val="20"/>
+        </w:rPr>
         <w:t>plagiarism,</w:t>
       </w:r>
       <w:r>
         <w:rPr>
           <w:spacing w:val="-15"/>
-        </w:rPr>
-        <w:t xml:space="preserve"> </w:t>
-      </w:r>
-      <w:r>
+          <w:sz w:val="20"/>
+          <w:szCs w:val="20"/>
+        </w:rPr>
+        <w:t xml:space="preserve"> </w:t>
+      </w:r>
+      <w:r>
+        <w:rPr>
+          <w:sz w:val="20"/>
+          <w:szCs w:val="20"/>
+        </w:rPr>
         <w:t>and an anonymous copy</w:t>
       </w:r>
       <w:r>
         <w:rPr>
           <w:spacing w:val="-2"/>
-        </w:rPr>
-        <w:t xml:space="preserve"> </w:t>
-      </w:r>
-      <w:r>
+          <w:sz w:val="20"/>
+          <w:szCs w:val="20"/>
+        </w:rPr>
+        <w:t xml:space="preserve"> </w:t>
+      </w:r>
+      <w:r>
+        <w:rPr>
+          <w:sz w:val="20"/>
+          <w:szCs w:val="20"/>
+        </w:rPr>
         <w:t>of</w:t>
       </w:r>
       <w:r>
         <w:rPr>
           <w:spacing w:val="-1"/>
-        </w:rPr>
-        <w:t xml:space="preserve"> </w:t>
-      </w:r>
-      <w:r>
+          <w:sz w:val="20"/>
+          <w:szCs w:val="20"/>
+        </w:rPr>
+        <w:t xml:space="preserve"> </w:t>
+      </w:r>
+      <w:r>
+        <w:rPr>
+          <w:sz w:val="20"/>
+          <w:szCs w:val="20"/>
+        </w:rPr>
         <w:t>the assignment</w:t>
       </w:r>
       <w:r>
         <w:rPr>
           <w:spacing w:val="-1"/>
-        </w:rPr>
-        <w:t xml:space="preserve"> </w:t>
-      </w:r>
-      <w:r>
+          <w:sz w:val="20"/>
+          <w:szCs w:val="20"/>
+        </w:rPr>
+        <w:t xml:space="preserve"> </w:t>
+      </w:r>
+      <w:r>
+        <w:rPr>
+          <w:sz w:val="20"/>
+          <w:szCs w:val="20"/>
+        </w:rPr>
         <w:t>may</w:t>
       </w:r>
       <w:r>
         <w:rPr>
           <w:spacing w:val="-2"/>
-        </w:rPr>
-        <w:t xml:space="preserve"> </w:t>
-      </w:r>
-      <w:r>
+          <w:sz w:val="20"/>
+          <w:szCs w:val="20"/>
+        </w:rPr>
+        <w:t xml:space="preserve"> </w:t>
+      </w:r>
+      <w:r>
+        <w:rPr>
+          <w:sz w:val="20"/>
+          <w:szCs w:val="20"/>
+        </w:rPr>
         <w:t>be</w:t>
       </w:r>
       <w:r>
         <w:rPr>
           <w:spacing w:val="-2"/>
-        </w:rPr>
-        <w:t xml:space="preserve"> </w:t>
-      </w:r>
-      <w:r>
+          <w:sz w:val="20"/>
+          <w:szCs w:val="20"/>
+        </w:rPr>
+        <w:t xml:space="preserve"> </w:t>
+      </w:r>
+      <w:r>
+        <w:rPr>
+          <w:sz w:val="20"/>
+          <w:szCs w:val="20"/>
+        </w:rPr>
         <w:t>retained on</w:t>
       </w:r>
       <w:r>
         <w:rPr>
           <w:spacing w:val="-2"/>
-        </w:rPr>
-        <w:t xml:space="preserve"> </w:t>
-      </w:r>
-      <w:r>
+          <w:sz w:val="20"/>
+          <w:szCs w:val="20"/>
+        </w:rPr>
+        <w:t xml:space="preserve"> </w:t>
+      </w:r>
+      <w:r>
+        <w:rPr>
+          <w:sz w:val="20"/>
+          <w:szCs w:val="20"/>
+        </w:rPr>
         <w:t>the database</w:t>
       </w:r>
       <w:r>
         <w:rPr>
           <w:spacing w:val="-5"/>
-        </w:rPr>
-        <w:t xml:space="preserve"> </w:t>
-      </w:r>
-      <w:r>
+          <w:sz w:val="20"/>
+          <w:szCs w:val="20"/>
+        </w:rPr>
+        <w:t xml:space="preserve"> </w:t>
+      </w:r>
+      <w:r>
+        <w:rPr>
+          <w:sz w:val="20"/>
+          <w:szCs w:val="20"/>
+        </w:rPr>
         <w:t>and used</w:t>
       </w:r>
       <w:r>
         <w:rPr>
           <w:spacing w:val="-2"/>
-        </w:rPr>
-        <w:t xml:space="preserve"> </w:t>
-      </w:r>
-      <w:r>
+          <w:sz w:val="20"/>
+          <w:szCs w:val="20"/>
+        </w:rPr>
+        <w:t xml:space="preserve"> </w:t>
+      </w:r>
+      <w:r>
+        <w:rPr>
+          <w:sz w:val="20"/>
+          <w:szCs w:val="20"/>
+        </w:rPr>
         <w:t>to make comparisons with other assignments in future.</w:t>
       </w:r>
     </w:p>
@@ -1862,126 +2659,212 @@
         </w:tabs>
         <w:spacing w:before="77"/>
         <w:ind w:left="1051" w:right="372" w:hanging="363"/>
-      </w:pPr>
-      <w:r>
+        <w:rPr>
+          <w:sz w:val="20"/>
+          <w:szCs w:val="20"/>
+        </w:rPr>
+      </w:pPr>
+      <w:r>
+        <w:rPr>
+          <w:sz w:val="20"/>
+          <w:szCs w:val="20"/>
+        </w:rPr>
         <w:t>By</w:t>
       </w:r>
       <w:r>
         <w:rPr>
           <w:spacing w:val="-16"/>
-        </w:rPr>
-        <w:t xml:space="preserve"> </w:t>
-      </w:r>
-      <w:r>
+          <w:sz w:val="20"/>
+          <w:szCs w:val="20"/>
+        </w:rPr>
+        <w:t xml:space="preserve"> </w:t>
+      </w:r>
+      <w:r>
+        <w:rPr>
+          <w:sz w:val="20"/>
+          <w:szCs w:val="20"/>
+        </w:rPr>
         <w:t>completing</w:t>
       </w:r>
       <w:r>
         <w:rPr>
           <w:spacing w:val="-16"/>
-        </w:rPr>
-        <w:t xml:space="preserve"> </w:t>
-      </w:r>
-      <w:r>
+          <w:sz w:val="20"/>
+          <w:szCs w:val="20"/>
+        </w:rPr>
+        <w:t xml:space="preserve"> </w:t>
+      </w:r>
+      <w:r>
+        <w:rPr>
+          <w:sz w:val="20"/>
+          <w:szCs w:val="20"/>
+        </w:rPr>
         <w:t>this</w:t>
       </w:r>
       <w:r>
         <w:rPr>
           <w:spacing w:val="-15"/>
-        </w:rPr>
-        <w:t xml:space="preserve"> </w:t>
-      </w:r>
-      <w:r>
+          <w:sz w:val="20"/>
+          <w:szCs w:val="20"/>
+        </w:rPr>
+        <w:t xml:space="preserve"> </w:t>
+      </w:r>
+      <w:r>
+        <w:rPr>
+          <w:sz w:val="20"/>
+          <w:szCs w:val="20"/>
+        </w:rPr>
         <w:t>coversheet</w:t>
       </w:r>
       <w:r>
         <w:rPr>
           <w:spacing w:val="-15"/>
-        </w:rPr>
-        <w:t xml:space="preserve"> </w:t>
-      </w:r>
-      <w:r>
+          <w:sz w:val="20"/>
+          <w:szCs w:val="20"/>
+        </w:rPr>
+        <w:t xml:space="preserve"> </w:t>
+      </w:r>
+      <w:r>
+        <w:rPr>
+          <w:sz w:val="20"/>
+          <w:szCs w:val="20"/>
+        </w:rPr>
         <w:t>in</w:t>
       </w:r>
       <w:r>
         <w:rPr>
           <w:spacing w:val="-15"/>
-        </w:rPr>
-        <w:t xml:space="preserve"> </w:t>
-      </w:r>
-      <w:r>
+          <w:sz w:val="20"/>
+          <w:szCs w:val="20"/>
+        </w:rPr>
+        <w:t xml:space="preserve"> </w:t>
+      </w:r>
+      <w:r>
+        <w:rPr>
+          <w:sz w:val="20"/>
+          <w:szCs w:val="20"/>
+        </w:rPr>
         <w:t>full</w:t>
       </w:r>
       <w:r>
         <w:rPr>
           <w:spacing w:val="-13"/>
-        </w:rPr>
-        <w:t xml:space="preserve"> </w:t>
-      </w:r>
-      <w:r>
+          <w:sz w:val="20"/>
+          <w:szCs w:val="20"/>
+        </w:rPr>
+        <w:t xml:space="preserve"> </w:t>
+      </w:r>
+      <w:r>
+        <w:rPr>
+          <w:sz w:val="20"/>
+          <w:szCs w:val="20"/>
+        </w:rPr>
         <w:t>and</w:t>
       </w:r>
       <w:r>
         <w:rPr>
           <w:spacing w:val="-16"/>
-        </w:rPr>
-        <w:t xml:space="preserve"> </w:t>
-      </w:r>
-      <w:r>
+          <w:sz w:val="20"/>
+          <w:szCs w:val="20"/>
+        </w:rPr>
+        <w:t xml:space="preserve"> </w:t>
+      </w:r>
+      <w:r>
+        <w:rPr>
+          <w:sz w:val="20"/>
+          <w:szCs w:val="20"/>
+        </w:rPr>
         <w:t>submitting</w:t>
       </w:r>
       <w:r>
         <w:rPr>
           <w:spacing w:val="-12"/>
-        </w:rPr>
-        <w:t xml:space="preserve"> </w:t>
-      </w:r>
-      <w:r>
+          <w:sz w:val="20"/>
+          <w:szCs w:val="20"/>
+        </w:rPr>
+        <w:t xml:space="preserve"> </w:t>
+      </w:r>
+      <w:r>
+        <w:rPr>
+          <w:sz w:val="20"/>
+          <w:szCs w:val="20"/>
+        </w:rPr>
         <w:t>this</w:t>
       </w:r>
       <w:r>
         <w:rPr>
           <w:spacing w:val="-12"/>
-        </w:rPr>
-        <w:t xml:space="preserve"> </w:t>
-      </w:r>
-      <w:r>
+          <w:sz w:val="20"/>
+          <w:szCs w:val="20"/>
+        </w:rPr>
+        <w:t xml:space="preserve"> </w:t>
+      </w:r>
+      <w:r>
+        <w:rPr>
+          <w:sz w:val="20"/>
+          <w:szCs w:val="20"/>
+        </w:rPr>
         <w:t>assignment</w:t>
       </w:r>
       <w:r>
         <w:rPr>
           <w:spacing w:val="-6"/>
-        </w:rPr>
-        <w:t xml:space="preserve"> </w:t>
-      </w:r>
-      <w:r>
+          <w:sz w:val="20"/>
+          <w:szCs w:val="20"/>
+        </w:rPr>
+        <w:t xml:space="preserve"> </w:t>
+      </w:r>
+      <w:r>
+        <w:rPr>
+          <w:sz w:val="20"/>
+          <w:szCs w:val="20"/>
+        </w:rPr>
         <w:t>electronically,</w:t>
       </w:r>
       <w:r>
         <w:rPr>
           <w:spacing w:val="-9"/>
-        </w:rPr>
-        <w:t xml:space="preserve"> </w:t>
-      </w:r>
-      <w:r>
+          <w:sz w:val="20"/>
+          <w:szCs w:val="20"/>
+        </w:rPr>
+        <w:t xml:space="preserve"> </w:t>
+      </w:r>
+      <w:r>
+        <w:rPr>
+          <w:sz w:val="20"/>
+          <w:szCs w:val="20"/>
+        </w:rPr>
         <w:t>I</w:t>
       </w:r>
       <w:r>
         <w:rPr>
           <w:spacing w:val="-9"/>
-        </w:rPr>
-        <w:t xml:space="preserve"> </w:t>
-      </w:r>
-      <w:r>
+          <w:sz w:val="20"/>
+          <w:szCs w:val="20"/>
+        </w:rPr>
+        <w:t xml:space="preserve"> </w:t>
+      </w:r>
+      <w:r>
+        <w:rPr>
+          <w:sz w:val="20"/>
+          <w:szCs w:val="20"/>
+        </w:rPr>
         <w:t xml:space="preserve">am bound by the conditions of the KOI’s </w:t>
       </w:r>
       <w:r>
         <w:rPr>
           <w:rFonts w:ascii="Arial" w:hAnsi="Arial"/>
           <w:i/>
+          <w:sz w:val="20"/>
+          <w:szCs w:val="20"/>
         </w:rPr>
         <w:t xml:space="preserve">Student Academic Misconduct Policy </w:t>
       </w:r>
       <w:r>
+        <w:rPr>
+          <w:sz w:val="20"/>
+          <w:szCs w:val="20"/>
+        </w:rPr>
         <w:t>and the declaration on this coversheet.</w:t>
       </w:r>
     </w:p>
@@ -2004,9 +2887,15 @@
           <w:tab w:val="left" w:pos="7324"/>
         </w:tabs>
         <w:ind w:left="4964"/>
-      </w:pPr>
-      <w:r>
-        <w:rPr>
+        <w:rPr>
+          <w:sz w:val="20"/>
+          <w:szCs w:val="20"/>
+        </w:rPr>
+      </w:pPr>
+      <w:r>
+        <w:rPr>
+          <w:sz w:val="20"/>
+          <w:szCs w:val="20"/>
           <w:u w:val="single"/>
         </w:rPr>
         <w:tab/>
@@ -2014,20 +2903,30 @@
       <w:r>
         <w:rPr>
           <w:spacing w:val="-10"/>
+          <w:sz w:val="20"/>
+          <w:szCs w:val="20"/>
         </w:rPr>
         <w:t>/</w:t>
       </w:r>
       <w:r>
         <w:rPr>
+          <w:sz w:val="20"/>
+          <w:szCs w:val="20"/>
           <w:u w:val="single"/>
         </w:rPr>
         <w:tab/>
       </w:r>
       <w:r>
+        <w:rPr>
+          <w:sz w:val="20"/>
+          <w:szCs w:val="20"/>
+        </w:rPr>
         <w:t xml:space="preserve">/ </w:t>
       </w:r>
       <w:r>
         <w:rPr>
+          <w:sz w:val="20"/>
+          <w:szCs w:val="20"/>
           <w:u w:val="single"/>
         </w:rPr>
         <w:tab/>
@@ -2036,16 +2935,11 @@
     <w:p>
       <w:pPr>
         <w:pStyle w:val="BodyText"/>
-        <w:spacing w:line="20" w:lineRule="exact"/>
         <w:ind w:left="969"/>
-        <w:rPr>
-          <w:sz w:val="2"/>
-        </w:rPr>
       </w:pPr>
       <w:r>
         <w:rPr>
           <w:noProof/>
-          <w:sz w:val="2"/>
         </w:rPr>
         <mc:AlternateContent>
           <mc:Choice Requires="wpg">
@@ -2168,11 +3062,18 @@
     <w:p>
       <w:pPr>
         <w:pStyle w:val="Heading1"/>
+        <w:spacing w:line="240" w:lineRule="auto"/>
         <w:ind w:left="565"/>
+        <w:rPr>
+          <w:sz w:val="20"/>
+          <w:szCs w:val="20"/>
+        </w:rPr>
       </w:pPr>
       <w:r>
         <w:rPr>
           <w:noProof/>
+          <w:sz w:val="20"/>
+          <w:szCs w:val="20"/>
         </w:rPr>
         <mc:AlternateContent>
           <mc:Choice Requires="wps">
@@ -2388,18 +3289,24 @@
       <w:r>
         <w:rPr>
           <w:spacing w:val="-2"/>
+          <w:sz w:val="20"/>
+          <w:szCs w:val="20"/>
         </w:rPr>
         <w:t>Assignment</w:t>
       </w:r>
       <w:r>
         <w:rPr>
           <w:spacing w:val="-4"/>
+          <w:sz w:val="20"/>
+          <w:szCs w:val="20"/>
         </w:rPr>
         <w:t xml:space="preserve"> </w:t>
       </w:r>
       <w:r>
         <w:rPr>
           <w:spacing w:val="-2"/>
+          <w:sz w:val="20"/>
+          <w:szCs w:val="20"/>
         </w:rPr>
         <w:t>Receipt</w:t>
       </w:r>
@@ -2411,7 +3318,6 @@
         <w:rPr>
           <w:rFonts w:ascii="Arial"/>
           <w:b/>
-          <w:sz w:val="28"/>
         </w:rPr>
       </w:pPr>
     </w:p>
@@ -2611,11 +3517,17 @@
           <w:tab w:val="left" w:pos="6260"/>
           <w:tab w:val="left" w:pos="7463"/>
         </w:tabs>
-        <w:spacing w:after="2" w:line="251" w:lineRule="exact"/>
+        <w:spacing w:after="2"/>
         <w:ind w:left="5103"/>
-      </w:pPr>
-      <w:r>
-        <w:rPr>
+        <w:rPr>
+          <w:sz w:val="20"/>
+          <w:szCs w:val="20"/>
+        </w:rPr>
+      </w:pPr>
+      <w:r>
+        <w:rPr>
+          <w:sz w:val="20"/>
+          <w:szCs w:val="20"/>
           <w:u w:val="single"/>
         </w:rPr>
         <w:tab/>
@@ -2623,20 +3535,30 @@
       <w:r>
         <w:rPr>
           <w:spacing w:val="-10"/>
+          <w:sz w:val="20"/>
+          <w:szCs w:val="20"/>
         </w:rPr>
         <w:t>/</w:t>
       </w:r>
       <w:r>
         <w:rPr>
+          <w:sz w:val="20"/>
+          <w:szCs w:val="20"/>
           <w:u w:val="single"/>
         </w:rPr>
         <w:tab/>
       </w:r>
       <w:r>
+        <w:rPr>
+          <w:sz w:val="20"/>
+          <w:szCs w:val="20"/>
+        </w:rPr>
         <w:t xml:space="preserve">/ </w:t>
       </w:r>
       <w:r>
         <w:rPr>
+          <w:sz w:val="20"/>
+          <w:szCs w:val="20"/>
           <w:u w:val="single"/>
         </w:rPr>
         <w:tab/>
@@ -2645,16 +3567,11 @@
     <w:p>
       <w:pPr>
         <w:pStyle w:val="BodyText"/>
-        <w:spacing w:line="20" w:lineRule="exact"/>
         <w:ind w:left="1067"/>
-        <w:rPr>
-          <w:sz w:val="2"/>
-        </w:rPr>
       </w:pPr>
       <w:r>
         <w:rPr>
           <w:noProof/>
-          <w:sz w:val="2"/>
         </w:rPr>
         <mc:AlternateContent>
           <mc:Choice Requires="wpg">
@@ -2744,7 +3661,6 @@
         <w:tabs>
           <w:tab w:val="left" w:pos="5821"/>
         </w:tabs>
-        <w:spacing w:line="228" w:lineRule="exact"/>
         <w:ind w:left="1910"/>
       </w:pPr>
       <w:r>
@@ -3460,17 +4376,7 @@
                 <w:spacing w:val="-2"/>
                 <w:sz w:val="18"/>
               </w:rPr>
-              <w:t>A</w:t>
-            </w:r>
-            <w:r>
-              <w:rPr>
-                <w:rFonts w:ascii="Arial"/>
-                <w:b/>
-                <w:color w:val="FFFFFF"/>
-                <w:spacing w:val="-2"/>
-                <w:sz w:val="18"/>
-              </w:rPr>
-              <w:t>lgorithm</w:t>
+              <w:t>Algorithm</w:t>
             </w:r>
           </w:p>
         </w:tc>
@@ -3849,23 +4755,7 @@
                 <w:spacing w:val="-2"/>
                 <w:sz w:val="20"/>
               </w:rPr>
-              <w:t>O(</w:t>
-            </w:r>
-            <w:proofErr w:type="spellStart"/>
-            <w:r>
-              <w:rPr>
-                <w:spacing w:val="-2"/>
-                <w:sz w:val="20"/>
-              </w:rPr>
-              <w:t>bm</w:t>
-            </w:r>
-            <w:proofErr w:type="spellEnd"/>
-            <w:r>
-              <w:rPr>
-                <w:spacing w:val="-2"/>
-                <w:sz w:val="20"/>
-              </w:rPr>
-              <w:t>)</w:t>
+              <w:t>O(bm)</w:t>
             </w:r>
           </w:p>
         </w:tc>
@@ -4379,15 +5269,7 @@
           <w:sz w:val="24"/>
           <w:szCs w:val="24"/>
         </w:rPr>
-        <w:t>)</w:t>
-      </w:r>
-      <w:r>
-        <w:rPr>
-          <w:rFonts w:ascii="Times New Roman" w:eastAsia="Times New Roman" w:hAnsi="Times New Roman" w:cs="Times New Roman"/>
-          <w:sz w:val="24"/>
-          <w:szCs w:val="24"/>
-        </w:rPr>
-        <w:t>,</w:t>
+        <w:t>),</w:t>
       </w:r>
       <w:r>
         <w:rPr>
@@ -4631,13 +5513,7 @@
         <w:rPr>
           <w:color w:val="1564BF"/>
         </w:rPr>
-        <w:t>Alg</w:t>
-      </w:r>
-      <w:r>
-        <w:rPr>
-          <w:color w:val="1564BF"/>
-        </w:rPr>
-        <w:t xml:space="preserve">orithm </w:t>
+        <w:t xml:space="preserve">Algorithm </w:t>
       </w:r>
       <w:r>
         <w:rPr>
@@ -5001,25 +5877,7 @@
           <w:sz w:val="24"/>
           <w:szCs w:val="24"/>
         </w:rPr>
-        <w:t xml:space="preserve">Continue from step 2 until there is no solution and the heap </w:t>
-      </w:r>
-      <w:proofErr w:type="gramStart"/>
-      <w:r>
-        <w:rPr>
-          <w:rFonts w:ascii="Times New Roman" w:eastAsia="Times New Roman" w:hAnsi="Times New Roman" w:cs="Times New Roman"/>
-          <w:sz w:val="24"/>
-          <w:szCs w:val="24"/>
-        </w:rPr>
-        <w:t>is</w:t>
-      </w:r>
-      <w:proofErr w:type="gramEnd"/>
-      <w:r>
-        <w:rPr>
-          <w:rFonts w:ascii="Times New Roman" w:eastAsia="Times New Roman" w:hAnsi="Times New Roman" w:cs="Times New Roman"/>
-          <w:sz w:val="24"/>
-          <w:szCs w:val="24"/>
-        </w:rPr>
-        <w:t xml:space="preserve"> empty. </w:t>
+        <w:t xml:space="preserve">Continue from step 2 until there is no solution and the heap is empty. </w:t>
       </w:r>
     </w:p>
     <w:p>
@@ -5408,6 +6266,7 @@
         <w:rPr>
           <w:rFonts w:ascii="Arial"/>
           <w:b/>
+          <w:noProof/>
           <w:sz w:val="24"/>
         </w:rPr>
         <w:drawing>
@@ -6532,25 +7391,7 @@
           <w:szCs w:val="24"/>
         </w:rPr>
         <w:br/>
-        <w:t xml:space="preserve">The algorithm's evolution for the </w:t>
-      </w:r>
-      <w:proofErr w:type="gramStart"/>
-      <w:r>
-        <w:rPr>
-          <w:rFonts w:ascii="Times New Roman" w:eastAsia="Times New Roman" w:hAnsi="Times New Roman" w:cs="Times New Roman"/>
-          <w:sz w:val="24"/>
-          <w:szCs w:val="24"/>
-        </w:rPr>
-        <w:t>hard initial</w:t>
-      </w:r>
-      <w:proofErr w:type="gramEnd"/>
-      <w:r>
-        <w:rPr>
-          <w:rFonts w:ascii="Times New Roman" w:eastAsia="Times New Roman" w:hAnsi="Times New Roman" w:cs="Times New Roman"/>
-          <w:sz w:val="24"/>
-          <w:szCs w:val="24"/>
-        </w:rPr>
-        <w:t xml:space="preserve"> configuration [8 1 3 / 4 _ 2 / 7 6 5], which was resolved in 14 steps, is shown in the figures below.</w:t>
+        <w:t>The algorithm's evolution for the hard initial configuration [8 1 3 / 4 _ 2 / 7 6 5], which was resolved in 14 steps, is shown in the figures below.</w:t>
       </w:r>
     </w:p>
     <w:p>
@@ -6563,6 +7404,7 @@
       </w:pPr>
       <w:r>
         <w:rPr>
+          <w:noProof/>
           <w:sz w:val="13"/>
         </w:rPr>
         <w:drawing>
@@ -6619,16 +7461,7 @@
           <w:color w:val="445964"/>
           <w:sz w:val="17"/>
         </w:rPr>
-        <w:t>F</w:t>
-      </w:r>
-      <w:r>
-        <w:rPr>
-          <w:rFonts w:ascii="Arial" w:hAnsi="Arial"/>
-          <w:i/>
-          <w:color w:val="445964"/>
-          <w:sz w:val="17"/>
-        </w:rPr>
-        <w:t xml:space="preserve">igure 2 – Selected steps of the A* solution path (hard configuration, 14 </w:t>
+        <w:t xml:space="preserve">Figure 2 – Selected steps of the A* solution path (hard configuration, 14 </w:t>
       </w:r>
       <w:r>
         <w:rPr>
@@ -6667,6 +7500,7 @@
       <w:r>
         <w:rPr>
           <w:rFonts w:ascii="Arial"/>
+          <w:noProof/>
         </w:rPr>
         <w:lastRenderedPageBreak/>
         <w:drawing>
@@ -7551,7 +8385,7 @@
                 <v:stroke joinstyle="miter"/>
                 <v:path gradientshapeok="t" o:connecttype="rect"/>
               </v:shapetype>
-              <v:shape id="Textbox 12" o:spid="_x0000_s1026" type="#_x0000_t202" style="position:absolute;left:0;text-align:left;margin-left:73.3pt;margin-top:-97.75pt;width:448.75pt;height:97.5pt;z-index:15733760;visibility:visible;mso-wrap-style:square;mso-wrap-distance-left:0;mso-wrap-distance-top:0;mso-wrap-distance-right:0;mso-wrap-distance-bottom:0;mso-position-horizontal:absolute;mso-position-horizontal-relative:page;mso-position-vertical:absolute;mso-position-vertical-relative:text;v-text-anchor:top" o:gfxdata="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" filled="f" stroked="f">
+              <v:shape id="Textbox 12" o:spid="_x0000_s1026" type="#_x0000_t202" style="position:absolute;left:0;text-align:left;margin-left:73.3pt;margin-top:-97.75pt;width:448.75pt;height:97.5pt;z-index:15733760;visibility:visible;mso-wrap-style:square;mso-wrap-distance-left:0;mso-wrap-distance-top:0;mso-wrap-distance-right:0;mso-wrap-distance-bottom:0;mso-position-horizontal:absolute;mso-position-horizontal-relative:page;mso-position-vertical:absolute;mso-position-vertical-relative:text;v-text-anchor:top" o:gfxdata="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" filled="f" stroked="f">
                 <v:textbox inset="0,0,0,0">
                   <w:txbxContent>
                     <w:tbl>
@@ -8442,14 +9276,7 @@
           <w:spacing w:val="-2"/>
         </w:rPr>
         <w:lastRenderedPageBreak/>
-        <w:t>C</w:t>
-      </w:r>
-      <w:r>
-        <w:rPr>
-          <w:color w:val="1564BF"/>
-          <w:spacing w:val="-2"/>
-        </w:rPr>
-        <w:t>onclusion</w:t>
+        <w:t>Conclusion</w:t>
       </w:r>
     </w:p>
     <w:p>
@@ -8614,19 +9441,11 @@
         </w:rPr>
         <w:t xml:space="preserve"> </w:t>
       </w:r>
-      <w:proofErr w:type="spellStart"/>
-      <w:r>
-        <w:rPr>
-          <w:sz w:val="20"/>
-        </w:rPr>
-        <w:t>Norvig</w:t>
-      </w:r>
-      <w:proofErr w:type="spellEnd"/>
-      <w:r>
-        <w:rPr>
-          <w:sz w:val="20"/>
-        </w:rPr>
-        <w:t>,</w:t>
+      <w:r>
+        <w:rPr>
+          <w:sz w:val="20"/>
+        </w:rPr>
+        <w:t>Norvig,</w:t>
       </w:r>
       <w:r>
         <w:rPr>
@@ -9440,19 +10259,11 @@
           <w:sz w:val="20"/>
         </w:rPr>
       </w:pPr>
-      <w:proofErr w:type="spellStart"/>
-      <w:r>
-        <w:rPr>
-          <w:sz w:val="20"/>
-        </w:rPr>
-        <w:t>Holte</w:t>
-      </w:r>
-      <w:proofErr w:type="spellEnd"/>
-      <w:r>
-        <w:rPr>
-          <w:sz w:val="20"/>
-        </w:rPr>
-        <w:t xml:space="preserve">, R. C. et al. (2017). Bidirectional search that is guaranteed to meet in the middle. </w:t>
+      <w:r>
+        <w:rPr>
+          <w:sz w:val="20"/>
+        </w:rPr>
+        <w:t xml:space="preserve">Holte, R. C. et al. (2017). Bidirectional search that is guaranteed to meet in the middle. </w:t>
       </w:r>
       <w:r>
         <w:rPr>
@@ -9489,7 +10300,7 @@
 </file>
 
 <file path=word/endnotes.xml><?xml version="1.0" encoding="utf-8"?>
-<w:endnotes xmlns:wpc="http://schemas.microsoft.com/office/word/2010/wordprocessingCanvas" xmlns:cx="http://schemas.microsoft.com/office/drawing/2014/chartex" xmlns:cx1="http://schemas.microsoft.com/office/drawing/2015/9/8/chartex" xmlns:cx2="http://schemas.microsoft.com/office/drawing/2015/10/21/chartex" xmlns:cx3="http://schemas.microsoft.com/office/drawing/2016/5/9/chartex" xmlns:cx4="http://schemas.microsoft.com/office/drawing/2016/5/10/chartex" xmlns:cx5="http://schemas.microsoft.com/office/drawing/2016/5/11/chartex" xmlns:cx6="http://schemas.microsoft.com/office/drawing/2016/5/12/chartex" xmlns:cx7="http://schemas.microsoft.com/office/drawing/2016/5/13/chartex" xmlns:cx8="http://schemas.microsoft.com/office/drawing/2016/5/14/chartex" xmlns:mc="http://schemas.openxmlformats.org/markup-compatibility/2006" xmlns:aink="http://schemas.microsoft.com/office/drawing/2016/ink" xmlns:am3d="http://schemas.microsoft.com/office/drawing/2017/model3d" xmlns:o="urn:schemas-microsoft-com:office:office" xmlns:r="http://schemas.openxmlformats.org/officeDocument/2006/relationships" xmlns:m="http://schemas.openxmlformats.org/officeDocument/2006/math" xmlns:v="urn:schemas-microsoft-com:vml" xmlns:wp14="http://schemas.microsoft.com/office/word/2010/wordprocessingDrawing" xmlns:wp="http://schemas.openxmlformats.org/drawingml/2006/wordprocessingDrawing" xmlns:w10="urn:schemas-microsoft-com:office:word" xmlns:w="http://schemas.openxmlformats.org/wordprocessingml/2006/main" xmlns:w14="http://schemas.microsoft.com/office/word/2010/wordml" xmlns:w15="http://schemas.microsoft.com/office/word/2012/wordml" xmlns:w16cex="http://schemas.microsoft.com/office/word/2018/wordml/cex" xmlns:w16cid="http://schemas.microsoft.com/office/word/2016/wordml/cid" xmlns:w16="http://schemas.microsoft.com/office/word/2018/wordml" xmlns:w16se="http://schemas.microsoft.com/office/word/2015/wordml/symex" xmlns:wpg="http://schemas.microsoft.com/office/word/2010/wordprocessingGroup" xmlns:wpi="http://schemas.microsoft.com/office/word/2010/wordprocessingInk" xmlns:wne="http://schemas.microsoft.com/office/word/2006/wordml" xmlns:wps="http://schemas.microsoft.com/office/word/2010/wordprocessingShape" mc:Ignorable="w14 w15 w16se w16cid w16 w16cex wp14">
+<w:endnotes xmlns:wpc="http://schemas.microsoft.com/office/word/2010/wordprocessingCanvas" xmlns:cx="http://schemas.microsoft.com/office/drawing/2014/chartex" xmlns:cx1="http://schemas.microsoft.com/office/drawing/2015/9/8/chartex" xmlns:cx2="http://schemas.microsoft.com/office/drawing/2015/10/21/chartex" xmlns:cx3="http://schemas.microsoft.com/office/drawing/2016/5/9/chartex" xmlns:cx4="http://schemas.microsoft.com/office/drawing/2016/5/10/chartex" xmlns:cx5="http://schemas.microsoft.com/office/drawing/2016/5/11/chartex" xmlns:cx6="http://schemas.microsoft.com/office/drawing/2016/5/12/chartex" xmlns:cx7="http://schemas.microsoft.com/office/drawing/2016/5/13/chartex" xmlns:cx8="http://schemas.microsoft.com/office/drawing/2016/5/14/chartex" xmlns:mc="http://schemas.openxmlformats.org/markup-compatibility/2006" xmlns:aink="http://schemas.microsoft.com/office/drawing/2016/ink" xmlns:am3d="http://schemas.microsoft.com/office/drawing/2017/model3d" xmlns:o="urn:schemas-microsoft-com:office:office" xmlns:oel="http://schemas.microsoft.com/office/2019/extlst" xmlns:r="http://schemas.openxmlformats.org/officeDocument/2006/relationships" xmlns:m="http://schemas.openxmlformats.org/officeDocument/2006/math" xmlns:v="urn:schemas-microsoft-com:vml" xmlns:wp14="http://schemas.microsoft.com/office/word/2010/wordprocessingDrawing" xmlns:wp="http://schemas.openxmlformats.org/drawingml/2006/wordprocessingDrawing" xmlns:w10="urn:schemas-microsoft-com:office:word" xmlns:w="http://schemas.openxmlformats.org/wordprocessingml/2006/main" xmlns:w14="http://schemas.microsoft.com/office/word/2010/wordml" xmlns:w15="http://schemas.microsoft.com/office/word/2012/wordml" xmlns:w16cex="http://schemas.microsoft.com/office/word/2018/wordml/cex" xmlns:w16cid="http://schemas.microsoft.com/office/word/2016/wordml/cid" xmlns:w16="http://schemas.microsoft.com/office/word/2018/wordml" xmlns:w16sdtdh="http://schemas.microsoft.com/office/word/2020/wordml/sdtdatahash" xmlns:w16se="http://schemas.microsoft.com/office/word/2015/wordml/symex" xmlns:wpg="http://schemas.microsoft.com/office/word/2010/wordprocessingGroup" xmlns:wpi="http://schemas.microsoft.com/office/word/2010/wordprocessingInk" xmlns:wne="http://schemas.microsoft.com/office/word/2006/wordml" xmlns:wps="http://schemas.microsoft.com/office/word/2010/wordprocessingShape" mc:Ignorable="w14 w15 w16se w16cid w16 w16cex w16sdtdh wp14">
   <w:endnote w:type="separator" w:id="-1">
     <w:p>
       <w:r>
@@ -9508,7 +10319,7 @@
 </file>
 
 <file path=word/footnotes.xml><?xml version="1.0" encoding="utf-8"?>
-<w:footnotes xmlns:wpc="http://schemas.microsoft.com/office/word/2010/wordprocessingCanvas" xmlns:cx="http://schemas.microsoft.com/office/drawing/2014/chartex" xmlns:cx1="http://schemas.microsoft.com/office/drawing/2015/9/8/chartex" xmlns:cx2="http://schemas.microsoft.com/office/drawing/2015/10/21/chartex" xmlns:cx3="http://schemas.microsoft.com/office/drawing/2016/5/9/chartex" xmlns:cx4="http://schemas.microsoft.com/office/drawing/2016/5/10/chartex" xmlns:cx5="http://schemas.microsoft.com/office/drawing/2016/5/11/chartex" xmlns:cx6="http://schemas.microsoft.com/office/drawing/2016/5/12/chartex" xmlns:cx7="http://schemas.microsoft.com/office/drawing/2016/5/13/chartex" xmlns:cx8="http://schemas.microsoft.com/office/drawing/2016/5/14/chartex" xmlns:mc="http://schemas.openxmlformats.org/markup-compatibility/2006" xmlns:aink="http://schemas.microsoft.com/office/drawing/2016/ink" xmlns:am3d="http://schemas.microsoft.com/office/drawing/2017/model3d" xmlns:o="urn:schemas-microsoft-com:office:office" xmlns:r="http://schemas.openxmlformats.org/officeDocument/2006/relationships" xmlns:m="http://schemas.openxmlformats.org/officeDocument/2006/math" xmlns:v="urn:schemas-microsoft-com:vml" xmlns:wp14="http://schemas.microsoft.com/office/word/2010/wordprocessingDrawing" xmlns:wp="http://schemas.openxmlformats.org/drawingml/2006/wordprocessingDrawing" xmlns:w10="urn:schemas-microsoft-com:office:word" xmlns:w="http://schemas.openxmlformats.org/wordprocessingml/2006/main" xmlns:w14="http://schemas.microsoft.com/office/word/2010/wordml" xmlns:w15="http://schemas.microsoft.com/office/word/2012/wordml" xmlns:w16cex="http://schemas.microsoft.com/office/word/2018/wordml/cex" xmlns:w16cid="http://schemas.microsoft.com/office/word/2016/wordml/cid" xmlns:w16="http://schemas.microsoft.com/office/word/2018/wordml" xmlns:w16se="http://schemas.microsoft.com/office/word/2015/wordml/symex" xmlns:wpg="http://schemas.microsoft.com/office/word/2010/wordprocessingGroup" xmlns:wpi="http://schemas.microsoft.com/office/word/2010/wordprocessingInk" xmlns:wne="http://schemas.microsoft.com/office/word/2006/wordml" xmlns:wps="http://schemas.microsoft.com/office/word/2010/wordprocessingShape" mc:Ignorable="w14 w15 w16se w16cid w16 w16cex wp14">
+<w:footnotes xmlns:wpc="http://schemas.microsoft.com/office/word/2010/wordprocessingCanvas" xmlns:cx="http://schemas.microsoft.com/office/drawing/2014/chartex" xmlns:cx1="http://schemas.microsoft.com/office/drawing/2015/9/8/chartex" xmlns:cx2="http://schemas.microsoft.com/office/drawing/2015/10/21/chartex" xmlns:cx3="http://schemas.microsoft.com/office/drawing/2016/5/9/chartex" xmlns:cx4="http://schemas.microsoft.com/office/drawing/2016/5/10/chartex" xmlns:cx5="http://schemas.microsoft.com/office/drawing/2016/5/11/chartex" xmlns:cx6="http://schemas.microsoft.com/office/drawing/2016/5/12/chartex" xmlns:cx7="http://schemas.microsoft.com/office/drawing/2016/5/13/chartex" xmlns:cx8="http://schemas.microsoft.com/office/drawing/2016/5/14/chartex" xmlns:mc="http://schemas.openxmlformats.org/markup-compatibility/2006" xmlns:aink="http://schemas.microsoft.com/office/drawing/2016/ink" xmlns:am3d="http://schemas.microsoft.com/office/drawing/2017/model3d" xmlns:o="urn:schemas-microsoft-com:office:office" xmlns:oel="http://schemas.microsoft.com/office/2019/extlst" xmlns:r="http://schemas.openxmlformats.org/officeDocument/2006/relationships" xmlns:m="http://schemas.openxmlformats.org/officeDocument/2006/math" xmlns:v="urn:schemas-microsoft-com:vml" xmlns:wp14="http://schemas.microsoft.com/office/word/2010/wordprocessingDrawing" xmlns:wp="http://schemas.openxmlformats.org/drawingml/2006/wordprocessingDrawing" xmlns:w10="urn:schemas-microsoft-com:office:word" xmlns:w="http://schemas.openxmlformats.org/wordprocessingml/2006/main" xmlns:w14="http://schemas.microsoft.com/office/word/2010/wordml" xmlns:w15="http://schemas.microsoft.com/office/word/2012/wordml" xmlns:w16cex="http://schemas.microsoft.com/office/word/2018/wordml/cex" xmlns:w16cid="http://schemas.microsoft.com/office/word/2016/wordml/cid" xmlns:w16="http://schemas.microsoft.com/office/word/2018/wordml" xmlns:w16sdtdh="http://schemas.microsoft.com/office/word/2020/wordml/sdtdatahash" xmlns:w16se="http://schemas.microsoft.com/office/word/2015/wordml/symex" xmlns:wpg="http://schemas.microsoft.com/office/word/2010/wordprocessingGroup" xmlns:wpi="http://schemas.microsoft.com/office/word/2010/wordprocessingInk" xmlns:wne="http://schemas.microsoft.com/office/word/2006/wordml" xmlns:wps="http://schemas.microsoft.com/office/word/2010/wordprocessingShape" mc:Ignorable="w14 w15 w16se w16cid w16 w16cex w16sdtdh wp14">
   <w:footnote w:type="separator" w:id="-1">
     <w:p>
       <w:r>
@@ -9527,7 +10338,7 @@
 </file>
 
 <file path=word/numbering.xml><?xml version="1.0" encoding="utf-8"?>
-<w:numbering xmlns:wpc="http://schemas.microsoft.com/office/word/2010/wordprocessingCanvas" xmlns:cx="http://schemas.microsoft.com/office/drawing/2014/chartex" xmlns:cx1="http://schemas.microsoft.com/office/drawing/2015/9/8/chartex" xmlns:cx2="http://schemas.microsoft.com/office/drawing/2015/10/21/chartex" xmlns:cx3="http://schemas.microsoft.com/office/drawing/2016/5/9/chartex" xmlns:cx4="http://schemas.microsoft.com/office/drawing/2016/5/10/chartex" xmlns:cx5="http://schemas.microsoft.com/office/drawing/2016/5/11/chartex" xmlns:cx6="http://schemas.microsoft.com/office/drawing/2016/5/12/chartex" xmlns:cx7="http://schemas.microsoft.com/office/drawing/2016/5/13/chartex" xmlns:cx8="http://schemas.microsoft.com/office/drawing/2016/5/14/chartex" xmlns:mc="http://schemas.openxmlformats.org/markup-compatibility/2006" xmlns:aink="http://schemas.microsoft.com/office/drawing/2016/ink" xmlns:am3d="http://schemas.microsoft.com/office/drawing/2017/model3d" xmlns:o="urn:schemas-microsoft-com:office:office" xmlns:r="http://schemas.openxmlformats.org/officeDocument/2006/relationships" xmlns:m="http://schemas.openxmlformats.org/officeDocument/2006/math" xmlns:v="urn:schemas-microsoft-com:vml" xmlns:wp14="http://schemas.microsoft.com/office/word/2010/wordprocessingDrawing" xmlns:wp="http://schemas.openxmlformats.org/drawingml/2006/wordprocessingDrawing" xmlns:w10="urn:schemas-microsoft-com:office:word" xmlns:w="http://schemas.openxmlformats.org/wordprocessingml/2006/main" xmlns:w14="http://schemas.microsoft.com/office/word/2010/wordml" xmlns:w15="http://schemas.microsoft.com/office/word/2012/wordml" xmlns:w16cex="http://schemas.microsoft.com/office/word/2018/wordml/cex" xmlns:w16cid="http://schemas.microsoft.com/office/word/2016/wordml/cid" xmlns:w16="http://schemas.microsoft.com/office/word/2018/wordml" xmlns:w16se="http://schemas.microsoft.com/office/word/2015/wordml/symex" xmlns:wpg="http://schemas.microsoft.com/office/word/2010/wordprocessingGroup" xmlns:wpi="http://schemas.microsoft.com/office/word/2010/wordprocessingInk" xmlns:wne="http://schemas.microsoft.com/office/word/2006/wordml" xmlns:wps="http://schemas.microsoft.com/office/word/2010/wordprocessingShape" mc:Ignorable="w14 w15 w16se w16cid w16 w16cex wp14">
+<w:numbering xmlns:wpc="http://schemas.microsoft.com/office/word/2010/wordprocessingCanvas" xmlns:cx="http://schemas.microsoft.com/office/drawing/2014/chartex" xmlns:cx1="http://schemas.microsoft.com/office/drawing/2015/9/8/chartex" xmlns:cx2="http://schemas.microsoft.com/office/drawing/2015/10/21/chartex" xmlns:cx3="http://schemas.microsoft.com/office/drawing/2016/5/9/chartex" xmlns:cx4="http://schemas.microsoft.com/office/drawing/2016/5/10/chartex" xmlns:cx5="http://schemas.microsoft.com/office/drawing/2016/5/11/chartex" xmlns:cx6="http://schemas.microsoft.com/office/drawing/2016/5/12/chartex" xmlns:cx7="http://schemas.microsoft.com/office/drawing/2016/5/13/chartex" xmlns:cx8="http://schemas.microsoft.com/office/drawing/2016/5/14/chartex" xmlns:mc="http://schemas.openxmlformats.org/markup-compatibility/2006" xmlns:aink="http://schemas.microsoft.com/office/drawing/2016/ink" xmlns:am3d="http://schemas.microsoft.com/office/drawing/2017/model3d" xmlns:o="urn:schemas-microsoft-com:office:office" xmlns:oel="http://schemas.microsoft.com/office/2019/extlst" xmlns:r="http://schemas.openxmlformats.org/officeDocument/2006/relationships" xmlns:m="http://schemas.openxmlformats.org/officeDocument/2006/math" xmlns:v="urn:schemas-microsoft-com:vml" xmlns:wp14="http://schemas.microsoft.com/office/word/2010/wordprocessingDrawing" xmlns:wp="http://schemas.openxmlformats.org/drawingml/2006/wordprocessingDrawing" xmlns:w10="urn:schemas-microsoft-com:office:word" xmlns:w="http://schemas.openxmlformats.org/wordprocessingml/2006/main" xmlns:w14="http://schemas.microsoft.com/office/word/2010/wordml" xmlns:w15="http://schemas.microsoft.com/office/word/2012/wordml" xmlns:w16cex="http://schemas.microsoft.com/office/word/2018/wordml/cex" xmlns:w16cid="http://schemas.microsoft.com/office/word/2016/wordml/cid" xmlns:w16="http://schemas.microsoft.com/office/word/2018/wordml" xmlns:w16sdtdh="http://schemas.microsoft.com/office/word/2020/wordml/sdtdatahash" xmlns:w16se="http://schemas.microsoft.com/office/word/2015/wordml/symex" xmlns:wpg="http://schemas.microsoft.com/office/word/2010/wordprocessingGroup" xmlns:wpi="http://schemas.microsoft.com/office/word/2010/wordprocessingInk" xmlns:wne="http://schemas.microsoft.com/office/word/2006/wordml" xmlns:wps="http://schemas.microsoft.com/office/word/2010/wordprocessingShape" mc:Ignorable="w14 w15 w16se w16cid w16 w16cex w16sdtdh wp14">
   <w:abstractNum w:abstractNumId="0" w15:restartNumberingAfterBreak="0">
     <w:nsid w:val="1F484AAE"/>
     <w:multiLevelType w:val="hybridMultilevel"/>
@@ -10374,32 +11185,32 @@
       </w:rPr>
     </w:lvl>
   </w:abstractNum>
-  <w:num w:numId="1">
+  <w:num w:numId="1" w16cid:durableId="1245991721">
     <w:abstractNumId w:val="2"/>
   </w:num>
-  <w:num w:numId="2">
+  <w:num w:numId="2" w16cid:durableId="1721133038">
     <w:abstractNumId w:val="0"/>
   </w:num>
-  <w:num w:numId="3">
+  <w:num w:numId="3" w16cid:durableId="1727799939">
     <w:abstractNumId w:val="5"/>
   </w:num>
-  <w:num w:numId="4">
+  <w:num w:numId="4" w16cid:durableId="667975522">
     <w:abstractNumId w:val="4"/>
   </w:num>
-  <w:num w:numId="5">
+  <w:num w:numId="5" w16cid:durableId="637103593">
     <w:abstractNumId w:val="1"/>
   </w:num>
-  <w:num w:numId="6">
+  <w:num w:numId="6" w16cid:durableId="377826345">
     <w:abstractNumId w:val="6"/>
   </w:num>
-  <w:num w:numId="7">
+  <w:num w:numId="7" w16cid:durableId="769424049">
     <w:abstractNumId w:val="3"/>
   </w:num>
 </w:numbering>
 </file>
 
 <file path=word/styles.xml><?xml version="1.0" encoding="utf-8"?>
-<w:styles xmlns:mc="http://schemas.openxmlformats.org/markup-compatibility/2006" xmlns:r="http://schemas.openxmlformats.org/officeDocument/2006/relationships" xmlns:w="http://schemas.openxmlformats.org/wordprocessingml/2006/main" xmlns:w14="http://schemas.microsoft.com/office/word/2010/wordml" xmlns:w15="http://schemas.microsoft.com/office/word/2012/wordml" xmlns:w16cex="http://schemas.microsoft.com/office/word/2018/wordml/cex" xmlns:w16cid="http://schemas.microsoft.com/office/word/2016/wordml/cid" xmlns:w16="http://schemas.microsoft.com/office/word/2018/wordml" xmlns:w16se="http://schemas.microsoft.com/office/word/2015/wordml/symex" mc:Ignorable="w14 w15 w16se w16cid w16 w16cex">
+<w:styles xmlns:mc="http://schemas.openxmlformats.org/markup-compatibility/2006" xmlns:r="http://schemas.openxmlformats.org/officeDocument/2006/relationships" xmlns:w="http://schemas.openxmlformats.org/wordprocessingml/2006/main" xmlns:w14="http://schemas.microsoft.com/office/word/2010/wordml" xmlns:w15="http://schemas.microsoft.com/office/word/2012/wordml" xmlns:w16cex="http://schemas.microsoft.com/office/word/2018/wordml/cex" xmlns:w16cid="http://schemas.microsoft.com/office/word/2016/wordml/cid" xmlns:w16="http://schemas.microsoft.com/office/word/2018/wordml" xmlns:w16sdtdh="http://schemas.microsoft.com/office/word/2020/wordml/sdtdatahash" xmlns:w16se="http://schemas.microsoft.com/office/word/2015/wordml/symex" mc:Ignorable="w14 w15 w16se w16cid w16 w16cex w16sdtdh">
   <w:docDefaults>
     <w:rPrDefault>
       <w:rPr>

</xml_diff>